<commit_message>
Added web site chathealthy.ai
</commit_message>
<xml_diff>
--- a/Documentation/FindCarePromptsMemorializedCreationgfunctionalityforTheApplication.docx
+++ b/Documentation/FindCarePromptsMemorializedCreationgfunctionalityforTheApplication.docx
@@ -7118,15 +7118,3656 @@
           <w:szCs w:val="20"/>
         </w:rPr>
       </w:pPr>
-    </w:p>
-    <w:p>
-      <w:pPr>
-        <w:rPr>
-          <w:rStyle w:val="SubtleEmphasis"/>
-          <w:sz w:val="20"/>
-          <w:szCs w:val="20"/>
-        </w:rPr>
-      </w:pPr>
+      <w:r>
+        <w:rPr>
+          <w:rStyle w:val="SubtleEmphasis"/>
+          <w:sz w:val="20"/>
+          <w:szCs w:val="20"/>
+        </w:rPr>
+        <w:br w:type="page"/>
+      </w:r>
+    </w:p>
+    <w:p>
+      <w:pPr>
+        <w:pStyle w:val="Heading2"/>
+        <w:rPr>
+          <w:rStyle w:val="SubtleEmphasis"/>
+          <w:sz w:val="20"/>
+          <w:szCs w:val="20"/>
+        </w:rPr>
+      </w:pPr>
+      <w:r>
+        <w:rPr>
+          <w:rStyle w:val="SubtleEmphasis"/>
+          <w:sz w:val="20"/>
+          <w:szCs w:val="20"/>
+        </w:rPr>
+        <w:lastRenderedPageBreak/>
+        <w:t>Prompt to enrich data of test results with answers from DB compared to answers from models.</w:t>
+      </w:r>
+    </w:p>
+    <w:p>
+      <w:r>
+        <w:t xml:space="preserve">You are a Mongo DB programmer using Python 3.11.9 and </w:t>
+      </w:r>
+      <w:proofErr w:type="spellStart"/>
+      <w:r>
+        <w:t>PyMongo</w:t>
+      </w:r>
+      <w:proofErr w:type="spellEnd"/>
+      <w:r>
+        <w:t xml:space="preserve"> </w:t>
+      </w:r>
+      <w:proofErr w:type="gramStart"/>
+      <w:r>
+        <w:t>4.16.0 .</w:t>
+      </w:r>
+      <w:proofErr w:type="gramEnd"/>
+      <w:r>
+        <w:t xml:space="preserve"> </w:t>
+      </w:r>
+    </w:p>
+    <w:p>
+      <w:r>
+        <w:t>I want you to write a method</w:t>
+      </w:r>
+      <w:r>
+        <w:t xml:space="preserve"> named </w:t>
+      </w:r>
+      <w:r>
+        <w:t>‘</w:t>
+      </w:r>
+      <w:proofErr w:type="spellStart"/>
+      <w:r>
+        <w:t>EnrichTestAnswers</w:t>
+      </w:r>
+      <w:proofErr w:type="spellEnd"/>
+      <w:r>
+        <w:t>’ with the following arguments:</w:t>
+      </w:r>
+    </w:p>
+    <w:p>
+      <w:pPr>
+        <w:pStyle w:val="ListParagraph"/>
+        <w:numPr>
+          <w:ilvl w:val="0"/>
+          <w:numId w:val="23"/>
+        </w:numPr>
+      </w:pPr>
+      <w:r>
+        <w:t>MongoDB connection</w:t>
+      </w:r>
+    </w:p>
+    <w:p>
+      <w:pPr>
+        <w:pStyle w:val="ListParagraph"/>
+        <w:numPr>
+          <w:ilvl w:val="0"/>
+          <w:numId w:val="23"/>
+        </w:numPr>
+      </w:pPr>
+      <w:proofErr w:type="spellStart"/>
+      <w:r>
+        <w:t>DatabaseName</w:t>
+      </w:r>
+      <w:proofErr w:type="spellEnd"/>
+    </w:p>
+    <w:p>
+      <w:pPr>
+        <w:pStyle w:val="ListParagraph"/>
+        <w:numPr>
+          <w:ilvl w:val="0"/>
+          <w:numId w:val="23"/>
+        </w:numPr>
+      </w:pPr>
+      <w:proofErr w:type="spellStart"/>
+      <w:r>
+        <w:t>ProviderCollectionName</w:t>
+      </w:r>
+      <w:proofErr w:type="spellEnd"/>
+    </w:p>
+    <w:p>
+      <w:pPr>
+        <w:pStyle w:val="ListParagraph"/>
+        <w:numPr>
+          <w:ilvl w:val="0"/>
+          <w:numId w:val="23"/>
+        </w:numPr>
+      </w:pPr>
+      <w:proofErr w:type="spellStart"/>
+      <w:r>
+        <w:t>TestFileCollectionName</w:t>
+      </w:r>
+      <w:proofErr w:type="spellEnd"/>
+    </w:p>
+    <w:p/>
+    <w:p>
+      <w:r>
+        <w:t xml:space="preserve">What you will be doing is iterating through the records in the </w:t>
+      </w:r>
+      <w:proofErr w:type="spellStart"/>
+      <w:r>
+        <w:t>TestFileCollection</w:t>
+      </w:r>
+      <w:proofErr w:type="spellEnd"/>
+      <w:r>
+        <w:t xml:space="preserve"> to determine the answers to the questions asked in the data.</w:t>
+      </w:r>
+    </w:p>
+    <w:p>
+      <w:r>
+        <w:t>Here are some sample records:</w:t>
+      </w:r>
+    </w:p>
+    <w:p>
+      <w:r>
+        <w:t>{"question": "How many physicians in Maine are classified as Women’s Health?", "Answer</w:t>
+      </w:r>
+      <w:proofErr w:type="gramStart"/>
+      <w:r>
+        <w:t>": {</w:t>
+      </w:r>
+      <w:proofErr w:type="gramEnd"/>
+      <w:r>
+        <w:t>"Quantity": 597, "Codes": ["207VC0300X", "207VF0040X", "207VG0400X", "207V00000X", "207VX0201X", "207VB0002X", "207VM0101X", "207VX0000X", "207VH0002X", "207VE0102X", "207VC0200X</w:t>
+      </w:r>
+      <w:proofErr w:type="gramStart"/>
+      <w:r>
+        <w:t>"]}}</w:t>
+      </w:r>
+      <w:proofErr w:type="gramEnd"/>
+    </w:p>
+    <w:p>
+      <w:r>
+        <w:t>{"question": "How many clinical psychologists are currently practicing in Alabama?", "Answer</w:t>
+      </w:r>
+      <w:proofErr w:type="gramStart"/>
+      <w:r>
+        <w:t>": {</w:t>
+      </w:r>
+      <w:proofErr w:type="gramEnd"/>
+      <w:r>
+        <w:t>"Quantity": 2637, "Codes": ["103TC0700X", "103TC2200X", "103GC0700X</w:t>
+      </w:r>
+      <w:proofErr w:type="gramStart"/>
+      <w:r>
+        <w:t>"]}}</w:t>
+      </w:r>
+      <w:proofErr w:type="gramEnd"/>
+    </w:p>
+    <w:p>
+      <w:r>
+        <w:t>{"question": "How many radiologists practice in Nogales?", "Answer": {"Quantity": 4136, "Codes": ["2085N0700X", "2085R0001X", "2085R0203X", "2085N0904X", "2085B0100X", "2085H0002X", "2085D0003X", "2085R0205X", "2085R0204X", "2085P0229X", "2085R0202X", "2085U0001X"]}}</w:t>
+      </w:r>
+    </w:p>
+    <w:p>
+      <w:r>
+        <w:t>{"question": "How many Procedural Specialty doctors are in Guilford County 96?", "Answer</w:t>
+      </w:r>
+      <w:proofErr w:type="gramStart"/>
+      <w:r>
+        <w:t>": {</w:t>
+      </w:r>
+      <w:proofErr w:type="gramEnd"/>
+      <w:r>
+        <w:t>"Quantity": 3946, "Codes": ["207LC0200X", "207L00000X", "207LA0401X", "207LH0002X", "207LP2900X", "207LP4000X", "207LP3000X</w:t>
+      </w:r>
+      <w:proofErr w:type="gramStart"/>
+      <w:r>
+        <w:t>"]}}</w:t>
+      </w:r>
+      <w:proofErr w:type="gramEnd"/>
+    </w:p>
+    <w:p>
+      <w:r>
+        <w:t xml:space="preserve">{"question": "How many Mental Health doctors are in Minneapolis?", "Answer": {"Quantity": 3790, "Codes": ["2084N0008X", "103TM1800X", "2084F0202X", "2084P0805X", "2084B0040X", "103TC0700X", "2084N0600X", "103TF0200X", "103TP0016X", "2084H0002X", "2084P0800X", "103TH0100X", "103GC0700X", "103TS0200X", "103TP0814X", "103TC1900X", "103TE1100X", "103TA0400X", "2084N0400X", "2084D0003X", "2084P2900X", "103TE1000X", "2084A2900X", "103TB0200X", "2084P0301X", "2084A0401X", "103TW0100X", "2084S0012X", "103TF0000X", "103TP2701X", "2084B0002X", "103T00000X", "2084P0804X", "103TH0004X", "103TA0700X", "2084V0102X", "103TM1700X", "103TP2700X", </w:t>
+      </w:r>
+      <w:r>
+        <w:lastRenderedPageBreak/>
+        <w:t>"103G00000X", "2084P0015X", "2084P0802X", "2084S0010X", "2084P0005X", "103TC2200X", "2084N0402X", "103TR0400X", "2084E0001X"]}}</w:t>
+      </w:r>
+    </w:p>
+    <w:p>
+      <w:r>
+        <w:t>{"question": "How many neurologists are in Lincoln County 667?", "Answer": {"Quantity": 2700, "Codes": ["2084N0008X", "2084F0202X", "2084P0805X", "2084B0040X", "2084N0600X", "2084H0002X", "2084P0800X", "2084N0400X", "2084D0003X", "2084P2900X", "2084A2900X", "2084P0301X", "2084A0401X", "2084S0012X", "2084B0002X", "2084P0804X", "2084V0102X", "2084P0015X", "2084P0802X", "2084S0010X", "2084P0005X", "2084N0402X", "2084E0001X"]}}</w:t>
+      </w:r>
+    </w:p>
+    <w:p>
+      <w:r>
+        <w:t>{"question": "How many dermatologists work in Racine County 273?", "Answer</w:t>
+      </w:r>
+      <w:proofErr w:type="gramStart"/>
+      <w:r>
+        <w:t>": {</w:t>
+      </w:r>
+      <w:proofErr w:type="gramEnd"/>
+      <w:r>
+        <w:t>"Quantity": 3572, "Codes": ["207NP0225X", "207NS0135X", "207NI0002X", "207ND0900X", "207N00000X", "207ND0101X</w:t>
+      </w:r>
+      <w:proofErr w:type="gramStart"/>
+      <w:r>
+        <w:t>"]}}</w:t>
+      </w:r>
+      <w:proofErr w:type="gramEnd"/>
+    </w:p>
+    <w:p>
+      <w:r>
+        <w:t>{"question": "How many Diagnostic Specialty physicians are in Prince William County 355?", "Answer": {"Quantity": 3953, "Codes": ["2085N0700X", "207ZD0900X", "2085B0100X", "2085H0002X", "207ZM0300X", "2085P0229X", "2085R0203X", "207ZP0102X", "207ZF0201X", "207ZC0006X", "207ZC0008X", "2085D0003X", "2085R0204X", "207ZB0001X", "207ZP0213X", "2085R0001X", "207ZP0105X", "2085N0904X", "207ZN0500X", "2085R0205X", "207ZC0500X", "207ZP0104X", "207ZP0101X", "207ZP0007X", "207ZI0100X", "207ZH0000X", "2085R0202X", "2085U0001X"]}}</w:t>
+      </w:r>
+    </w:p>
+    <w:p>
+      <w:r>
+        <w:t>{"question": "How many Women’s Health doctors are in New York?", "Answer": {"Quantity": 516, "Codes": ["207VC0300X", "207VF0040X", "207VG0400X", "207V00000X", "207VX0201X", "207VB0002X", "207VM0101X", "207VX0000X", "207VH0002X", "207VE0102X", "207VC0200X"]}}</w:t>
+      </w:r>
+    </w:p>
+    <w:p>
+      <w:r>
+        <w:t>{"question": "How many psychiatrists are in Cincinnati?", "Answer": {"Quantity": 1849, "Codes": ["2084N0008X", "2084F0202X", "2084P0805X", "2084B0040X", "2084N0600X", "2084H0002X", "2084P0800X", "2084N0400X", "2084D0003X", "2084P2900X", "2084A2900X", "2084P0301X", "2084A0401X", "2084S0012X", "2084B0002X", "2084P0804X", "2084V0102X", "2084P0015X", "2084P0802X", "2084S0010X", "2084P0005X", "2084N0402X", "2084E0001X"]}}</w:t>
+      </w:r>
+    </w:p>
+    <w:p>
+      <w:r>
+        <w:t>{"question": "How many physicians in Beatrice are in Surgical Specialty?", "Answer</w:t>
+      </w:r>
+      <w:proofErr w:type="gramStart"/>
+      <w:r>
+        <w:t>": {</w:t>
+      </w:r>
+      <w:proofErr w:type="gramEnd"/>
+      <w:r>
+        <w:t>"Quantity": 3460, "Codes": ["Unknown</w:t>
+      </w:r>
+      <w:proofErr w:type="gramStart"/>
+      <w:r>
+        <w:t>"]}}</w:t>
+      </w:r>
+      <w:proofErr w:type="gramEnd"/>
+    </w:p>
+    <w:p>
+      <w:r>
+        <w:t>{"question": "How many physicians in Louisiana are classified as Procedural Specialty?", "Answer</w:t>
+      </w:r>
+      <w:proofErr w:type="gramStart"/>
+      <w:r>
+        <w:t>": {</w:t>
+      </w:r>
+      <w:proofErr w:type="gramEnd"/>
+      <w:r>
+        <w:t>"Quantity": 5111, "Codes": ["207LC0200X", "207L00000X", "207LA0401X", "207LH0002X", "207LP2900X", "207LP4000X", "207LP3000X</w:t>
+      </w:r>
+      <w:proofErr w:type="gramStart"/>
+      <w:r>
+        <w:t>"]}}</w:t>
+      </w:r>
+      <w:proofErr w:type="gramEnd"/>
+    </w:p>
+    <w:p>
+      <w:r>
+        <w:lastRenderedPageBreak/>
+        <w:t>{"question": "How many OB-GYNs are in Hamilton County 400?", "Answer</w:t>
+      </w:r>
+      <w:proofErr w:type="gramStart"/>
+      <w:r>
+        <w:t>": {</w:t>
+      </w:r>
+      <w:proofErr w:type="gramEnd"/>
+      <w:r>
+        <w:t>"Quantity": 2329, "Codes": ["207VC0300X", "207VF0040X", "207VG0400X", "207V00000X", "207VX0201X", "207VB0002X", "207VM0101X", "207VX0000X", "207VH0002X", "207VE0102X", "207VC0200X</w:t>
+      </w:r>
+      <w:proofErr w:type="gramStart"/>
+      <w:r>
+        <w:t>"]}}</w:t>
+      </w:r>
+      <w:proofErr w:type="gramEnd"/>
+    </w:p>
+    <w:p>
+      <w:r>
+        <w:t>{"question": "How many family doctors work in ZIP code 33139?", "Answer</w:t>
+      </w:r>
+      <w:proofErr w:type="gramStart"/>
+      <w:r>
+        <w:t>": {</w:t>
+      </w:r>
+      <w:proofErr w:type="gramEnd"/>
+      <w:r>
+        <w:t>"Quantity": 435, "Codes": ["207QA0401X", "207QS1201X", "207QS0010X", "207QG0300X", "207QA0505X", "207QH0002X", "207QP0002X", "207QB0002X", "207Q00000X", "207QA0000X</w:t>
+      </w:r>
+      <w:proofErr w:type="gramStart"/>
+      <w:r>
+        <w:t>"]}}</w:t>
+      </w:r>
+      <w:proofErr w:type="gramEnd"/>
+    </w:p>
+    <w:p>
+      <w:r>
+        <w:t>{"question": "How many physicians in the United States are currently classified as Acute Care?", "Answer": {"Quantity": 114343, "Codes": ["2086S0102X", "207LC0200X", "2084A2900X", "207PS0010X", "207PT0002X", "207PE0005X", "2080P0203X", "207P00000X", "207PH0002X", "207PE0004X", "207PP0204X", "207VC0200X", "207RC0200X"]}}</w:t>
+      </w:r>
+    </w:p>
+    <w:p>
+      <w:r>
+        <w:t>{"question": "How many emergency physicians are in Baltimore?", "Answer</w:t>
+      </w:r>
+      <w:proofErr w:type="gramStart"/>
+      <w:r>
+        <w:t>": {</w:t>
+      </w:r>
+      <w:proofErr w:type="gramEnd"/>
+      <w:r>
+        <w:t>"Quantity": 4824, "Codes": ["207PS0010X", "207PT0002X", "207PE0005X", "207P00000X", "207PH0002X", "207PE0004X", "207PP0204X</w:t>
+      </w:r>
+      <w:proofErr w:type="gramStart"/>
+      <w:r>
+        <w:t>"]}}</w:t>
+      </w:r>
+      <w:proofErr w:type="gramEnd"/>
+    </w:p>
+    <w:p>
+      <w:r>
+        <w:t>{"question": "How many cardiologists practice in York County 931?", "Answer</w:t>
+      </w:r>
+      <w:proofErr w:type="gramStart"/>
+      <w:r>
+        <w:t>": {</w:t>
+      </w:r>
+      <w:proofErr w:type="gramEnd"/>
+      <w:r>
+        <w:t>"Quantity": 1856, "Codes": ["207RA0001X", "2080P0202X", "207UN0901X", "207RI0011X</w:t>
+      </w:r>
+      <w:proofErr w:type="gramStart"/>
+      <w:r>
+        <w:t>"]}}</w:t>
+      </w:r>
+      <w:proofErr w:type="gramEnd"/>
+    </w:p>
+    <w:p>
+      <w:r>
+        <w:t>{"question": "How many Primary Care doctors are in Pinellas County 743?", "Answer": {"Quantity": 1238, "Codes": ["207RT0003X", "207RA0001X", "207RG0100X", "207QA0401X", "207QS1201X", "207RH0000X", "2080A0000X", "207RS0010X", "2080B0002X", "2080P0204X", "207R00000X", "207QH0002X", "207QP0002X", "207RH0003X", "2080P0214X", "2080C0008X", "2080P0207X", "2080N0001X", "2080P0205X", "2080H0002X", "2080P0201X", "2080T0002X", "207RH0005X", "207RH0002X", "207RP1002X", "207QS0010X", "207RN0300X", "207QA0505X", "207RI0011X", "207RR0500X", "2080P0208X", "207RC0200X", "2080P0006X", "207RG0300X", "207RC0000X", "207RE0101X", "2080I0007X", "2080P0206X", "207RA0401X", "2080P0210X", "207RB0002X", "2080P0216X", "207RS0012X", "207QG0300X", "2080P0008X", "2080T0004X", "208000000X", "207RM1200X", "207Q00000X", "207RI0008X", "2080P0202X", "207RI0200X", "2080P1004X", "2080S0012X", "2080S0010X", "207RX0202X", "207RP1001X", "207RC0001X", "2080P0203X", "207QB0002X", "207RA0000X", "207RA0201X", "207RA0002X", "207RI0001X", "207QA0000X"]}}</w:t>
+      </w:r>
+    </w:p>
+    <w:p>
+      <w:r>
+        <w:t>{"question": "How many oncologists practice in Kane County 694?", "Answer</w:t>
+      </w:r>
+      <w:proofErr w:type="gramStart"/>
+      <w:r>
+        <w:t>": {</w:t>
+      </w:r>
+      <w:proofErr w:type="gramEnd"/>
+      <w:r>
+        <w:t>"Quantity": 60, "Codes": ["2085R0001X", "207RX0202X", "2086X0206X", "207VX0201X", "207RH0003X", "2080P0207X</w:t>
+      </w:r>
+      <w:proofErr w:type="gramStart"/>
+      <w:r>
+        <w:t>"]}}</w:t>
+      </w:r>
+      <w:proofErr w:type="gramEnd"/>
+    </w:p>
+    <w:p>
+      <w:r>
+        <w:lastRenderedPageBreak/>
+        <w:t>{"question": "How many cardiologists are in Oklahoma?", "Answer</w:t>
+      </w:r>
+      <w:proofErr w:type="gramStart"/>
+      <w:r>
+        <w:t>": {</w:t>
+      </w:r>
+      <w:proofErr w:type="gramEnd"/>
+      <w:r>
+        <w:t>"Quantity": 5051, "Codes": ["207RA0001X", "2080P0202X", "207UN0901X", "207RI0011X</w:t>
+      </w:r>
+      <w:proofErr w:type="gramStart"/>
+      <w:r>
+        <w:t>"]}}</w:t>
+      </w:r>
+      <w:proofErr w:type="gramEnd"/>
+    </w:p>
+    <w:p>
+      <w:r>
+        <w:t>{"question": "How many psychiatrists work in Oklahoma?", "Answer": {"Quantity": 681, "Codes": ["2084N0008X", "2084F0202X", "2084P0805X", "2084B0040X", "2084N0600X", "2084H0002X", "2084P0800X", "2084N0400X", "2084D0003X", "2084P2900X", "2084A2900X", "2084P0301X", "2084A0401X", "2084S0012X", "2084B0002X", "2084P0804X", "2084V0102X", "2084P0015X", "2084P0802X", "2084S0010X", "2084P0005X", "2084N0402X", "2084E0001X"]}}</w:t>
+      </w:r>
+    </w:p>
+    <w:p>
+      <w:r>
+        <w:t>{"question": "How many neurologists are in Prince George's County 985?", "Answer": {"Quantity": 503, "Codes": ["2084N0008X", "2084F0202X", "2084P0805X", "2084B0040X", "2084N0600X", "2084H0002X", "2084P0800X", "2084N0400X", "2084D0003X", "2084P2900X", "2084A2900X", "2084P0301X", "2084A0401X", "2084S0012X", "2084B0002X", "2084P0804X", "2084V0102X", "2084P0015X", "2084P0802X", "2084S0010X", "2084P0005X", "2084N0402X", "2084E0001X"]}}</w:t>
+      </w:r>
+    </w:p>
+    <w:p>
+      <w:r>
+        <w:t>{"question": "How many Surgical Specialty doctors are in Broward County 883?", "Answer": {"Quantity": 858, "Codes": ["2086S0102X", "2086X0206X", "2086P0122X", "207XS0114X", "207XX0005X", "2086S0105X", "207XX0004X", "2082S0105X", "2086H0002X", "2086S0120X", "204E00000X", "208600000X", "207XP3100X", "207X00000X", "2086S0127X", "2082S0099X", "208G00000X", "2086S0122X", "208200000X", "2086S0129X", "207XS0106X", "207XS0117X", "207XX0801X", "204F00000X", "208C00000X", "207T00000X"]}}</w:t>
+      </w:r>
+    </w:p>
+    <w:p>
+      <w:r>
+        <w:t>{"question": "How many Mental Health doctors are in Queens County 554?", "Answer": {"Quantity": 3055, "Codes": ["2084N0008X", "103TM1800X", "2084F0202X", "2084P0805X", "2084B0040X", "103TC0700X", "2084N0600X", "103TF0200X", "103TP0016X", "2084H0002X", "2084P0800X", "103TH0100X", "103GC0700X", "103TS0200X", "103TP0814X", "103TC1900X", "103TE1100X", "103TA0400X", "2084N0400X", "2084D0003X", "2084P2900X", "103TE1000X", "2084A2900X", "103TB0200X", "2084P0301X", "2084A0401X", "103TW0100X", "2084S0012X", "103TF0000X", "103TP2701X", "2084B0002X", "103T00000X", "2084P0804X", "103TH0004X", "103TA0700X", "2084V0102X", "103TM1700X", "103TP2700X", "103G00000X", "2084P0015X", "2084P0802X", "2084S0010X", "2084P0005X", "103TC2200X", "2084N0402X", "103TR0400X", "2084E0001X"]}}</w:t>
+      </w:r>
+    </w:p>
+    <w:p>
+      <w:r>
+        <w:t>{"question": "How many Acute Care doctors are in New York?", "Answer</w:t>
+      </w:r>
+      <w:proofErr w:type="gramStart"/>
+      <w:r>
+        <w:t>": {</w:t>
+      </w:r>
+      <w:proofErr w:type="gramEnd"/>
+      <w:r>
+        <w:t>"Quantity": 823, "Codes": ["2086S0102X", "207LC0200X", "2084A2900X", "207PS0010X", "207PT0002X", "207PE0005X", "2080P0203X", "207P00000X", "207PH0002X", "207PE0004X", "207PP0204X", "207VC0200X", "207RC0200X</w:t>
+      </w:r>
+      <w:proofErr w:type="gramStart"/>
+      <w:r>
+        <w:t>"]}}</w:t>
+      </w:r>
+      <w:proofErr w:type="gramEnd"/>
+    </w:p>
+    <w:p>
+      <w:r>
+        <w:lastRenderedPageBreak/>
+        <w:t>{"question": "How many cardiologists are in the United States?", "Answer": {"Quantity": 108937, "Codes": ["207RA0001X", "2080P0202X", "207UN0901X", "207RI0011X"]}}</w:t>
+      </w:r>
+    </w:p>
+    <w:p>
+      <w:r>
+        <w:t>{"question": "How many clinical psychologists work in Prince George's County 665?", "Answer</w:t>
+      </w:r>
+      <w:proofErr w:type="gramStart"/>
+      <w:r>
+        <w:t>": {</w:t>
+      </w:r>
+      <w:proofErr w:type="gramEnd"/>
+      <w:r>
+        <w:t>"Quantity": 97, "Codes": ["103TC0700X", "103TC2200X", "103GC0700X</w:t>
+      </w:r>
+      <w:proofErr w:type="gramStart"/>
+      <w:r>
+        <w:t>"]}}</w:t>
+      </w:r>
+      <w:proofErr w:type="gramEnd"/>
+    </w:p>
+    <w:p>
+      <w:r>
+        <w:t>{"question": "How many oncologists work in Las Vegas?", "Answer</w:t>
+      </w:r>
+      <w:proofErr w:type="gramStart"/>
+      <w:r>
+        <w:t>": {</w:t>
+      </w:r>
+      <w:proofErr w:type="gramEnd"/>
+      <w:r>
+        <w:t>"Quantity": 5632, "Codes": ["2085R0001X", "207RX0202X", "2086X0206X", "207VX0201X", "207RH0003X", "2080P0207X</w:t>
+      </w:r>
+      <w:proofErr w:type="gramStart"/>
+      <w:r>
+        <w:t>"]}}</w:t>
+      </w:r>
+      <w:proofErr w:type="gramEnd"/>
+    </w:p>
+    <w:p>
+      <w:r>
+        <w:t>{"question": "How many family doctors are in Dallas County 203?", "Answer</w:t>
+      </w:r>
+      <w:proofErr w:type="gramStart"/>
+      <w:r>
+        <w:t>": {</w:t>
+      </w:r>
+      <w:proofErr w:type="gramEnd"/>
+      <w:r>
+        <w:t>"Quantity": 2058, "Codes": ["207QA0401X", "207QS1201X", "207QS0010X", "207QG0300X", "207QA0505X", "207QH0002X", "207QP0002X", "207QB0002X", "207Q00000X", "207QA0000X</w:t>
+      </w:r>
+      <w:proofErr w:type="gramStart"/>
+      <w:r>
+        <w:t>"]}}</w:t>
+      </w:r>
+      <w:proofErr w:type="gramEnd"/>
+    </w:p>
+    <w:p>
+      <w:r>
+        <w:t>{"question": "How many OB-GYNs practice in Lincoln County 202?", "Answer</w:t>
+      </w:r>
+      <w:proofErr w:type="gramStart"/>
+      <w:r>
+        <w:t>": {</w:t>
+      </w:r>
+      <w:proofErr w:type="gramEnd"/>
+      <w:r>
+        <w:t>"Quantity": 2832, "Codes": ["207VC0300X", "207VF0040X", "207VG0400X", "207V00000X", "207VX0201X", "207VB0002X", "207VM0101X", "207VX0000X", "207VH0002X", "207VE0102X", "207VC0200X</w:t>
+      </w:r>
+      <w:proofErr w:type="gramStart"/>
+      <w:r>
+        <w:t>"]}}</w:t>
+      </w:r>
+      <w:proofErr w:type="gramEnd"/>
+    </w:p>
+    <w:p>
+      <w:r>
+        <w:t>{"question": "How many Surgical Specialty physicians are in Minnesota?", "Answer": {"Quantity": 1815, "Codes": ["2086S0102X", "2086X0206X", "2086P0122X", "207XS0114X", "207XX0005X", "2086S0105X", "207XX0004X", "2082S0105X", "2086H0002X", "2086S0120X", "204E00000X", "208600000X", "207XP3100X", "207X00000X", "2086S0127X", "2082S0099X", "208G00000X", "2086S0122X", "208200000X", "2086S0129X", "207XS0106X", "207XS0117X", "207XX0801X", "204F00000X", "208C00000X", "207T00000X"]}}</w:t>
+      </w:r>
+    </w:p>
+    <w:p>
+      <w:r>
+        <w:t>{"question": "How many physicians in Florida are in Procedural Specialty?", "Answer</w:t>
+      </w:r>
+      <w:proofErr w:type="gramStart"/>
+      <w:r>
+        <w:t>": {</w:t>
+      </w:r>
+      <w:proofErr w:type="gramEnd"/>
+      <w:r>
+        <w:t>"Quantity": 1742, "Codes": ["Unknown</w:t>
+      </w:r>
+      <w:proofErr w:type="gramStart"/>
+      <w:r>
+        <w:t>"]}}</w:t>
+      </w:r>
+      <w:proofErr w:type="gramEnd"/>
+    </w:p>
+    <w:p>
+      <w:r>
+        <w:t>{"question": "How many OB-GYNs practice in Milwaukee County 205?", "Answer</w:t>
+      </w:r>
+      <w:proofErr w:type="gramStart"/>
+      <w:r>
+        <w:t>": {</w:t>
+      </w:r>
+      <w:proofErr w:type="gramEnd"/>
+      <w:r>
+        <w:t>"Quantity": 1677, "Codes": ["207VC0300X", "207VF0040X", "207VG0400X", "207V00000X", "207VX0201X", "207VB0002X", "207VM0101X", "207VX0000X", "207VH0002X", "207VE0102X", "207VC0200X</w:t>
+      </w:r>
+      <w:proofErr w:type="gramStart"/>
+      <w:r>
+        <w:t>"]}}</w:t>
+      </w:r>
+      <w:proofErr w:type="gramEnd"/>
+    </w:p>
+    <w:p>
+      <w:r>
+        <w:t>{"question": "How many physicians in Washington County 319 are in Mental Health?", "Answer</w:t>
+      </w:r>
+      <w:proofErr w:type="gramStart"/>
+      <w:r>
+        <w:t>": {</w:t>
+      </w:r>
+      <w:proofErr w:type="gramEnd"/>
+      <w:r>
+        <w:t>"Quantity": 972, "Codes": ["Unknown</w:t>
+      </w:r>
+      <w:proofErr w:type="gramStart"/>
+      <w:r>
+        <w:t>"]}}</w:t>
+      </w:r>
+      <w:proofErr w:type="gramEnd"/>
+    </w:p>
+    <w:p>
+      <w:r>
+        <w:t>{"question": "How many Women’s Health doctors are in Sidney?", "Answer": {"Quantity": 1720, "Codes": ["207VC0300X", "207VF0040X", "207VG0400X", "207V00000X", "207VX0201X", "207VB0002X", "207VM0101X", "207VX0000X", "207VH0002X", "207VE0102X", "207VC0200X"]}}</w:t>
+      </w:r>
+    </w:p>
+    <w:p>
+      <w:r>
+        <w:lastRenderedPageBreak/>
+        <w:t>{"question": "How many Medical Specialty doctors are in Mississippi?", "Answer": {"Quantity": 2941, "Codes": ["2084N0008X", "207RA0001X", "207RG0100X", "2084F0202X", "2084P0805X", "2084B0040X", "2086X0206X", "207NS0135X", "2084N0600X", "207RH0003X", "207ND0900X", "2080P0207X", "207N00000X", "2080P0205X", "2084H0002X", "2084P0800X", "207NI0002X", "207RI0011X", "207RR0500X", "207ND0101X", "2084N0400X", "207UN0901X", "2084D0003X", "2084P2900X", "207RE0101X", "207NP0225X", "2080P0206X", "2080P0216X", "2084A2900X", "2085R0001X", "2084P0301X", "207VX0201X", "2084A0401X", "2084S0012X", "207VE0102X", "2084B0002X", "2080P0202X", "2084P0804X", "2084V0102X", "207RX0202X", "2084P0015X", "2084P0802X", "2084S0010X", "2084P0005X", "2084N0402X", "2084E0001X"]}}</w:t>
+      </w:r>
+    </w:p>
+    <w:p>
+      <w:r>
+        <w:t>{"question": "How many Mental Health physicians are in Phoenix?", "Answer": {"Quantity": 2792, "Codes": ["2084N0008X", "103TM1800X", "2084F0202X", "2084P0805X", "2084B0040X", "103TC0700X", "2084N0600X", "103TF0200X", "103TP0016X", "2084H0002X", "2084P0800X", "103TH0100X", "103GC0700X", "103TS0200X", "103TP0814X", "103TC1900X", "103TE1100X", "103TA0400X", "2084N0400X", "2084D0003X", "2084P2900X", "103TE1000X", "2084A2900X", "103TB0200X", "2084P0301X", "2084A0401X", "103TW0100X", "2084S0012X", "103TF0000X", "103TP2701X", "2084B0002X", "103T00000X", "2084P0804X", "103TH0004X", "103TA0700X", "2084V0102X", "103TM1700X", "103TP2700X", "103G00000X", "2084P0015X", "2084P0802X", "2084S0010X", "2084P0005X", "103TC2200X", "2084N0402X", "103TR0400X", "2084E0001X"]}}</w:t>
+      </w:r>
+    </w:p>
+    <w:p>
+      <w:r>
+        <w:t>{"question": "How many Surgical Specialty doctors are in San Francisco?", "Answer": {"Quantity": 2958, "Codes": ["2086S0102X", "2086X0206X", "2086P0122X", "207XS0114X", "207XX0005X", "2086S0105X", "207XX0004X", "2082S0105X", "2086H0002X", "2086S0120X", "204E00000X", "208600000X", "207XP3100X", "207X00000X", "2086S0127X", "2082S0099X", "208G00000X", "2086S0122X", "208200000X", "2086S0129X", "207XS0106X", "207XS0117X", "207XX0801X", "204F00000X", "208C00000X", "207T00000X"]}}</w:t>
+      </w:r>
+    </w:p>
+    <w:p>
+      <w:r>
+        <w:t>{"question": "How many Diagnostic Specialty doctors are in Minneapolis?", "Answer": {"Quantity": 5244, "Codes": ["2085N0700X", "207ZD0900X", "2085B0100X", "2085H0002X", "207ZM0300X", "2085P0229X", "2085R0203X", "207ZP0102X", "207ZF0201X", "207ZC0006X", "207ZC0008X", "2085D0003X", "2085R0204X", "207ZB0001X", "207ZP0213X", "2085R0001X", "207ZP0105X", "2085N0904X", "207ZN0500X", "2085R0205X", "207ZC0500X", "207ZP0104X", "207ZP0101X", "207ZP0007X", "207ZI0100X", "207ZH0000X", "2085R0202X", "2085U0001X"]}}</w:t>
+      </w:r>
+    </w:p>
+    <w:p>
+      <w:r>
+        <w:t xml:space="preserve">{"question": "How many Surgical Specialty physicians are in Prince George's County 665?", "Answer": {"Quantity": 253, "Codes": ["2086S0102X", "2086X0206X", "2086P0122X", "207XS0114X", "207XX0005X", "2086S0105X", "207XX0004X", "2082S0105X", "2086H0002X", </w:t>
+      </w:r>
+      <w:r>
+        <w:lastRenderedPageBreak/>
+        <w:t>"2086S0120X", "204E00000X", "208600000X", "207XP3100X", "207X00000X", "2086S0127X", "2082S0099X", "208G00000X", "2086S0122X", "208200000X", "2086S0129X", "207XS0106X", "207XS0117X", "207XX0801X", "204F00000X", "208C00000X", "207T00000X"]}}</w:t>
+      </w:r>
+    </w:p>
+    <w:p>
+      <w:r>
+        <w:t>{"question": "How many Procedural Specialty doctors are in Northampton County 582?", "Answer</w:t>
+      </w:r>
+      <w:proofErr w:type="gramStart"/>
+      <w:r>
+        <w:t>": {</w:t>
+      </w:r>
+      <w:proofErr w:type="gramEnd"/>
+      <w:r>
+        <w:t>"Quantity": 3011, "Codes": ["207LC0200X", "207L00000X", "207LA0401X", "207LH0002X", "207LP2900X", "207LP4000X", "207LP3000X</w:t>
+      </w:r>
+      <w:proofErr w:type="gramStart"/>
+      <w:r>
+        <w:t>"]}}</w:t>
+      </w:r>
+      <w:proofErr w:type="gramEnd"/>
+    </w:p>
+    <w:p/>
+    <w:p>
+      <w:r>
+        <w:t xml:space="preserve">You can see questions, can be classified as pertaining to a city, a county, or a state, asking for some count of physicians based on the specialties, listed in the ‘Code’ attribute. The answer is the answer that ChatGPT supplied via their Chat interface. </w:t>
+      </w:r>
+    </w:p>
+    <w:p/>
+    <w:p>
+      <w:r>
+        <w:t xml:space="preserve">You must classify the data by question type, meaning city, county, state, or other, and query the Provider collection. To determine the answer. </w:t>
+      </w:r>
+    </w:p>
+    <w:p>
+      <w:r>
+        <w:t>Some of the questions pertain to primary care physicians, and you are to use the attribute ‘Healthcare Provider Primary Taxonomy Switch_1’ in the provider collection and not the codes index for these questions.</w:t>
+      </w:r>
+      <w:r>
+        <w:t xml:space="preserve"> </w:t>
+      </w:r>
+      <w:proofErr w:type="gramStart"/>
+      <w:r>
+        <w:t>Thus</w:t>
+      </w:r>
+      <w:proofErr w:type="gramEnd"/>
+      <w:r>
+        <w:t xml:space="preserve"> you must classify if the question pertained to primary care physicians. </w:t>
+      </w:r>
+    </w:p>
+    <w:p/>
+    <w:p>
+      <w:r>
+        <w:t xml:space="preserve">Once determining that the question is not about primary care, you are to use the Codes array values to limit the providers you are counting to the </w:t>
+      </w:r>
+      <w:proofErr w:type="spellStart"/>
+      <w:r>
+        <w:t>tothe</w:t>
+      </w:r>
+      <w:proofErr w:type="spellEnd"/>
+      <w:r>
+        <w:t xml:space="preserve"> providers where any value in the ‘Codes’ array is equal to the value of the ‘Healthcare Provider Taxonomy Code_1’. Then you get the counts of providers that are in the cohort where you find a code to taxonomy code mach. </w:t>
+      </w:r>
+    </w:p>
+    <w:p/>
+    <w:p>
+      <w:r>
+        <w:t>Take the value in the ‘answer.</w:t>
+      </w:r>
+      <w:r>
+        <w:t xml:space="preserve"> </w:t>
+      </w:r>
+      <w:r>
+        <w:t xml:space="preserve">Quantity’ Test Data collection and put it into </w:t>
+      </w:r>
+      <w:proofErr w:type="gramStart"/>
+      <w:r>
+        <w:t>a</w:t>
+      </w:r>
+      <w:proofErr w:type="gramEnd"/>
+      <w:r>
+        <w:t xml:space="preserve"> attribute named ChatGPTGUI5_1. Which is a new </w:t>
+      </w:r>
+      <w:proofErr w:type="spellStart"/>
+      <w:r>
+        <w:t>atribute</w:t>
+      </w:r>
+      <w:proofErr w:type="spellEnd"/>
+      <w:r>
+        <w:t xml:space="preserve"> within the Answer attribute of the record. </w:t>
+      </w:r>
+    </w:p>
+    <w:p>
+      <w:r>
+        <w:t xml:space="preserve">Take the count you got from the Provider logic </w:t>
+      </w:r>
+      <w:proofErr w:type="gramStart"/>
+      <w:r>
+        <w:t>above, and</w:t>
+      </w:r>
+      <w:proofErr w:type="gramEnd"/>
+      <w:r>
+        <w:t xml:space="preserve"> insert that into the ‘</w:t>
+      </w:r>
+      <w:proofErr w:type="spellStart"/>
+      <w:proofErr w:type="gramStart"/>
+      <w:r>
+        <w:t>answer.Quantity</w:t>
+      </w:r>
+      <w:proofErr w:type="spellEnd"/>
+      <w:proofErr w:type="gramEnd"/>
+      <w:r>
+        <w:t xml:space="preserve">’ field. </w:t>
+      </w:r>
+    </w:p>
+    <w:p>
+      <w:r>
+        <w:t xml:space="preserve">If a question pertains to primary care do the same with the count you got from the primary care field. </w:t>
+      </w:r>
+    </w:p>
+    <w:p>
+      <w:r>
+        <w:t>Create a new field</w:t>
+      </w:r>
+      <w:r>
+        <w:t xml:space="preserve"> in the answer record, named </w:t>
+      </w:r>
+      <w:proofErr w:type="spellStart"/>
+      <w:r>
+        <w:t>GeographyInconclusive</w:t>
+      </w:r>
+      <w:proofErr w:type="spellEnd"/>
+      <w:r>
+        <w:t xml:space="preserve">. And if you can classify a record then mark this field ‘TRUE’ if you can not mark this field ‘FALSE’ In these </w:t>
+      </w:r>
+      <w:r>
+        <w:lastRenderedPageBreak/>
+        <w:t xml:space="preserve">records move the </w:t>
+      </w:r>
+      <w:proofErr w:type="gramStart"/>
+      <w:r>
+        <w:t>value s</w:t>
+      </w:r>
+      <w:proofErr w:type="gramEnd"/>
+      <w:r>
+        <w:t xml:space="preserve"> as before but in the </w:t>
+      </w:r>
+      <w:proofErr w:type="gramStart"/>
+      <w:r>
+        <w:t>Quantity</w:t>
+      </w:r>
+      <w:proofErr w:type="gramEnd"/>
+      <w:r>
+        <w:t xml:space="preserve"> field put ‘NULL’</w:t>
+      </w:r>
+      <w:r>
+        <w:t xml:space="preserve"> </w:t>
+      </w:r>
+      <w:r>
+        <w:t xml:space="preserve">and move the original value as before. </w:t>
+      </w:r>
+    </w:p>
+    <w:p>
+      <w:r>
+        <w:t xml:space="preserve"> </w:t>
+      </w:r>
+      <w:r>
+        <w:t xml:space="preserve">Hint, you can query for county, and city in the Provider Table to figure this out. You can make your own state table in the code. </w:t>
+      </w:r>
+    </w:p>
+    <w:p>
+      <w:r>
+        <w:t xml:space="preserve">Use the practice </w:t>
+      </w:r>
+      <w:proofErr w:type="gramStart"/>
+      <w:r>
+        <w:t>address</w:t>
+      </w:r>
+      <w:proofErr w:type="gramEnd"/>
+      <w:r>
+        <w:t xml:space="preserve"> if possible, but if it is missing use the mailing address to determine location. </w:t>
+      </w:r>
+    </w:p>
+    <w:p>
+      <w:r>
+        <w:t xml:space="preserve">Below is a producer record. </w:t>
+      </w:r>
+    </w:p>
+    <w:p/>
+    <w:p/>
+    <w:p>
+      <w:r>
+        <w:t>{</w:t>
+      </w:r>
+    </w:p>
+    <w:p>
+      <w:r>
+        <w:t xml:space="preserve">  "NPI": "1467455402",</w:t>
+      </w:r>
+    </w:p>
+    <w:p>
+      <w:r>
+        <w:t xml:space="preserve">  "Entity Type Code": "1",</w:t>
+      </w:r>
+    </w:p>
+    <w:p>
+      <w:r>
+        <w:t xml:space="preserve">  "Provider Organization Name (Legal Business Name)": null,</w:t>
+      </w:r>
+    </w:p>
+    <w:p>
+      <w:r>
+        <w:t xml:space="preserve">  "Provider Last Name (Legal Name)": "MCCOY",</w:t>
+      </w:r>
+    </w:p>
+    <w:p>
+      <w:r>
+        <w:t xml:space="preserve">  "Provider First Name": "SCOTT",</w:t>
+      </w:r>
+    </w:p>
+    <w:p>
+      <w:r>
+        <w:t xml:space="preserve">  "Provider Middle Name": "A",</w:t>
+      </w:r>
+    </w:p>
+    <w:p>
+      <w:r>
+        <w:t xml:space="preserve">  "Provider Name Prefix Text": "MR.",</w:t>
+      </w:r>
+    </w:p>
+    <w:p>
+      <w:r>
+        <w:t xml:space="preserve">  "Provider Name Suffix Text": null,</w:t>
+      </w:r>
+    </w:p>
+    <w:p>
+      <w:r>
+        <w:t xml:space="preserve">  "Provider Credential Text": "OT",</w:t>
+      </w:r>
+    </w:p>
+    <w:p>
+      <w:r>
+        <w:t xml:space="preserve">  "Provider First Line Business Mailing Address": "3050 N LITCHFIELD RD",</w:t>
+      </w:r>
+    </w:p>
+    <w:p>
+      <w:r>
+        <w:t xml:space="preserve">  "Provider Second Line Business Mailing Address": "SUITE 100",</w:t>
+      </w:r>
+    </w:p>
+    <w:p>
+      <w:r>
+        <w:t xml:space="preserve">  "Provider Business Mailing Address City Name": "GOODYEAR",</w:t>
+      </w:r>
+    </w:p>
+    <w:p>
+      <w:r>
+        <w:t xml:space="preserve">  "Provider Business Mailing Address State Name": "AZ",</w:t>
+      </w:r>
+    </w:p>
+    <w:p>
+      <w:r>
+        <w:t xml:space="preserve">  "Provider Business Mailing Address Postal Code": "85395",</w:t>
+      </w:r>
+    </w:p>
+    <w:p>
+      <w:r>
+        <w:t xml:space="preserve">  "Provider Business Mailing Address Telephone Number": "6239355505",</w:t>
+      </w:r>
+    </w:p>
+    <w:p>
+      <w:r>
+        <w:t xml:space="preserve">  "Provider First Line Business Practice Location Address": "3050 N LITCHFIELD RD",</w:t>
+      </w:r>
+    </w:p>
+    <w:p>
+      <w:r>
+        <w:t xml:space="preserve">  "Provider Second Line Business Practice Location Address": "SUITE 100",</w:t>
+      </w:r>
+    </w:p>
+    <w:p>
+      <w:r>
+        <w:lastRenderedPageBreak/>
+        <w:t xml:space="preserve">  "Provider Business Practice Location Address City Name": "GOODYEAR",</w:t>
+      </w:r>
+    </w:p>
+    <w:p>
+      <w:r>
+        <w:t xml:space="preserve">  "Provider Business Practice Location Address State Name": "AZ",</w:t>
+      </w:r>
+    </w:p>
+    <w:p>
+      <w:r>
+        <w:t xml:space="preserve">  "Provider Business Practice Location Address Postal Code": "85395",</w:t>
+      </w:r>
+    </w:p>
+    <w:p>
+      <w:r>
+        <w:t xml:space="preserve">  "Provider Sex Code": "M",</w:t>
+      </w:r>
+    </w:p>
+    <w:p>
+      <w:r>
+        <w:t xml:space="preserve">  "Healthcare Provider Taxonomy Code_1": "225XH1200X",</w:t>
+      </w:r>
+    </w:p>
+    <w:p>
+      <w:r>
+        <w:t xml:space="preserve">  "Provider License Number_1": "0250",</w:t>
+      </w:r>
+    </w:p>
+    <w:p>
+      <w:r>
+        <w:t xml:space="preserve">  "Provider License Number State Code_1": "AZ",</w:t>
+      </w:r>
+    </w:p>
+    <w:p>
+      <w:r>
+        <w:t xml:space="preserve">  "</w:t>
+      </w:r>
+      <w:r>
+        <w:t xml:space="preserve"> </w:t>
+      </w:r>
+      <w:r>
+        <w:t>Healthcare Provider Primary Taxonomy Switch_1": "Y",</w:t>
+      </w:r>
+    </w:p>
+    <w:p>
+      <w:r>
+        <w:t xml:space="preserve">  "Healthcare Provider Taxonomy Code_2": null,</w:t>
+      </w:r>
+    </w:p>
+    <w:p>
+      <w:r>
+        <w:t xml:space="preserve">  "Is Sole Proprietor": "N"</w:t>
+      </w:r>
+    </w:p>
+    <w:p>
+      <w:r>
+        <w:t>}</w:t>
+      </w:r>
+    </w:p>
+    <w:p/>
+    <w:p>
+      <w:r>
+        <w:t xml:space="preserve">Special rules, a county might be a city. I.e. New York County and New York City can be ‘New York’ in more than one attribute. The city name shall take precedence in this case. </w:t>
+      </w:r>
+    </w:p>
+    <w:p>
+      <w:pPr>
+        <w:rPr>
+          <w:rStyle w:val="SubtleEmphasis"/>
+          <w:sz w:val="20"/>
+          <w:szCs w:val="20"/>
+        </w:rPr>
+      </w:pPr>
+      <w:r>
+        <w:rPr>
+          <w:rStyle w:val="SubtleEmphasis"/>
+          <w:sz w:val="20"/>
+          <w:szCs w:val="20"/>
+        </w:rPr>
+        <w:br w:type="page"/>
+      </w:r>
+    </w:p>
+    <w:p>
+      <w:pPr>
+        <w:pStyle w:val="Heading2"/>
+        <w:rPr>
+          <w:rStyle w:val="SubtleEmphasis"/>
+          <w:sz w:val="20"/>
+          <w:szCs w:val="20"/>
+        </w:rPr>
+      </w:pPr>
+      <w:r>
+        <w:rPr>
+          <w:rStyle w:val="Heading3Char"/>
+        </w:rPr>
+        <w:lastRenderedPageBreak/>
+        <w:t xml:space="preserve">Provider </w:t>
+      </w:r>
+      <w:r>
+        <w:rPr>
+          <w:rStyle w:val="Heading3Char"/>
+        </w:rPr>
+        <w:t>enrichment</w:t>
+      </w:r>
+      <w:r>
+        <w:rPr>
+          <w:rStyle w:val="Heading3Char"/>
+        </w:rPr>
+        <w:t>.</w:t>
+      </w:r>
+      <w:r>
+        <w:rPr>
+          <w:rStyle w:val="Heading3Char"/>
+        </w:rPr>
+        <w:t xml:space="preserve"> </w:t>
+      </w:r>
+      <w:r>
+        <w:rPr>
+          <w:rStyle w:val="Heading3Char"/>
+        </w:rPr>
+        <w:t>add county information</w:t>
+      </w:r>
+      <w:r>
+        <w:rPr>
+          <w:rStyle w:val="SubtleEmphasis"/>
+          <w:sz w:val="20"/>
+          <w:szCs w:val="20"/>
+        </w:rPr>
+        <w:t xml:space="preserve">. </w:t>
+      </w:r>
+    </w:p>
+    <w:p>
+      <w:pPr>
+        <w:rPr>
+          <w:b/>
+          <w:bCs/>
+        </w:rPr>
+      </w:pPr>
+      <w:r>
+        <w:rPr>
+          <w:b/>
+          <w:bCs/>
+        </w:rPr>
+        <w:t>System Prompt</w:t>
+      </w:r>
+    </w:p>
+    <w:p>
+      <w:r>
+        <w:t xml:space="preserve">You are a Mongo </w:t>
+      </w:r>
+      <w:r>
+        <w:t xml:space="preserve">database programmer creating a microservice creating a </w:t>
+      </w:r>
+      <w:proofErr w:type="gramStart"/>
+      <w:r>
+        <w:t>new  Enriched</w:t>
+      </w:r>
+      <w:proofErr w:type="gramEnd"/>
+      <w:r>
+        <w:t xml:space="preserve"> Provider collection using 2 Mongo Collections. You are working with Python 3.11.9 </w:t>
+      </w:r>
+      <w:r>
+        <w:t xml:space="preserve">and </w:t>
+      </w:r>
+      <w:r>
+        <w:t>p</w:t>
+      </w:r>
+      <w:r>
+        <w:t>y</w:t>
+      </w:r>
+      <w:r>
+        <w:t>m</w:t>
+      </w:r>
+      <w:r>
+        <w:t>ongo version 4.1</w:t>
+      </w:r>
+      <w:r>
+        <w:t>6.0</w:t>
+      </w:r>
+      <w:r>
+        <w:t xml:space="preserve"> and you are communicating with the current version of Atlas. </w:t>
+      </w:r>
+      <w:r>
+        <w:t xml:space="preserve"> </w:t>
+      </w:r>
+    </w:p>
+    <w:p>
+      <w:pPr>
+        <w:rPr>
+          <w:b/>
+          <w:bCs/>
+        </w:rPr>
+      </w:pPr>
+      <w:r>
+        <w:rPr>
+          <w:b/>
+          <w:bCs/>
+        </w:rPr>
+        <w:t>User Prompt</w:t>
+      </w:r>
+      <w:r>
+        <w:rPr>
+          <w:b/>
+          <w:bCs/>
+        </w:rPr>
+        <w:t>:</w:t>
+      </w:r>
+    </w:p>
+    <w:p>
+      <w:pPr>
+        <w:pStyle w:val="Heading4"/>
+      </w:pPr>
+      <w:r>
+        <w:t>Goal:</w:t>
+      </w:r>
+    </w:p>
+    <w:p>
+      <w:r>
+        <w:t xml:space="preserve">Using two </w:t>
+      </w:r>
+      <w:r>
+        <w:t xml:space="preserve">existing </w:t>
+      </w:r>
+      <w:r>
+        <w:t xml:space="preserve">collections in an Atlas </w:t>
+      </w:r>
+      <w:proofErr w:type="gramStart"/>
+      <w:r>
+        <w:t xml:space="preserve">database, </w:t>
+      </w:r>
+      <w:r>
+        <w:t>(</w:t>
+      </w:r>
+      <w:proofErr w:type="gramEnd"/>
+      <w:r>
+        <w:t xml:space="preserve">PublicHealthData) </w:t>
+      </w:r>
+      <w:r>
+        <w:t xml:space="preserve">determine for all Provider records what county information should be associated with </w:t>
+      </w:r>
+      <w:r>
+        <w:t>each</w:t>
+      </w:r>
+      <w:r>
+        <w:t xml:space="preserve"> provider. </w:t>
+      </w:r>
+    </w:p>
+    <w:p>
+      <w:pPr>
+        <w:pStyle w:val="Heading4"/>
+      </w:pPr>
+      <w:r>
+        <w:t>Means</w:t>
+      </w:r>
+    </w:p>
+    <w:p>
+      <w:r>
+        <w:t xml:space="preserve">You will create a class </w:t>
+      </w:r>
+      <w:proofErr w:type="spellStart"/>
+      <w:proofErr w:type="gramStart"/>
+      <w:r>
+        <w:t>named</w:t>
+      </w:r>
+      <w:r>
+        <w:t>‘</w:t>
+      </w:r>
+      <w:proofErr w:type="gramEnd"/>
+      <w:r>
+        <w:t>EnrichProviderRecordsWithCountyData</w:t>
+      </w:r>
+      <w:proofErr w:type="spellEnd"/>
+      <w:r>
+        <w:t>’</w:t>
+      </w:r>
+      <w:r>
+        <w:t xml:space="preserve">. That will do this work. </w:t>
+      </w:r>
+      <w:r>
+        <w:t xml:space="preserve"> This class depends on the three data structures:</w:t>
+      </w:r>
+    </w:p>
+    <w:p>
+      <w:pPr>
+        <w:pStyle w:val="Heading4"/>
+      </w:pPr>
+      <w:r>
+        <w:t>County ZipEnriched_GDP</w:t>
+      </w:r>
+    </w:p>
+    <w:p>
+      <w:r>
+        <w:t>Here is a sample record:</w:t>
+      </w:r>
+    </w:p>
+    <w:p>
+      <w:pPr>
+        <w:rPr>
+          <w:rFonts w:ascii="Courier New" w:hAnsi="Courier New" w:cs="Courier New"/>
+          <w:sz w:val="16"/>
+          <w:szCs w:val="16"/>
+        </w:rPr>
+      </w:pPr>
+      <w:r>
+        <w:rPr>
+          <w:rFonts w:ascii="Courier New" w:hAnsi="Courier New" w:cs="Courier New"/>
+          <w:sz w:val="16"/>
+          <w:szCs w:val="16"/>
+        </w:rPr>
+        <w:t>{</w:t>
+      </w:r>
+    </w:p>
+    <w:p>
+      <w:pPr>
+        <w:rPr>
+          <w:rFonts w:ascii="Courier New" w:hAnsi="Courier New" w:cs="Courier New"/>
+          <w:sz w:val="16"/>
+          <w:szCs w:val="16"/>
+        </w:rPr>
+      </w:pPr>
+      <w:r>
+        <w:rPr>
+          <w:rFonts w:ascii="Courier New" w:hAnsi="Courier New" w:cs="Courier New"/>
+          <w:sz w:val="16"/>
+          <w:szCs w:val="16"/>
+        </w:rPr>
+        <w:t xml:space="preserve">  "_id</w:t>
+      </w:r>
+      <w:proofErr w:type="gramStart"/>
+      <w:r>
+        <w:rPr>
+          <w:rFonts w:ascii="Courier New" w:hAnsi="Courier New" w:cs="Courier New"/>
+          <w:sz w:val="16"/>
+          <w:szCs w:val="16"/>
+        </w:rPr>
+        <w:t>": {</w:t>
+      </w:r>
+      <w:proofErr w:type="gramEnd"/>
+    </w:p>
+    <w:p>
+      <w:pPr>
+        <w:rPr>
+          <w:rFonts w:ascii="Courier New" w:hAnsi="Courier New" w:cs="Courier New"/>
+          <w:sz w:val="16"/>
+          <w:szCs w:val="16"/>
+        </w:rPr>
+      </w:pPr>
+      <w:r>
+        <w:rPr>
+          <w:rFonts w:ascii="Courier New" w:hAnsi="Courier New" w:cs="Courier New"/>
+          <w:sz w:val="16"/>
+          <w:szCs w:val="16"/>
+        </w:rPr>
+        <w:t xml:space="preserve">    "$</w:t>
+      </w:r>
+      <w:proofErr w:type="spellStart"/>
+      <w:r>
+        <w:rPr>
+          <w:rFonts w:ascii="Courier New" w:hAnsi="Courier New" w:cs="Courier New"/>
+          <w:sz w:val="16"/>
+          <w:szCs w:val="16"/>
+        </w:rPr>
+        <w:t>oid</w:t>
+      </w:r>
+      <w:proofErr w:type="spellEnd"/>
+      <w:r>
+        <w:rPr>
+          <w:rFonts w:ascii="Courier New" w:hAnsi="Courier New" w:cs="Courier New"/>
+          <w:sz w:val="16"/>
+          <w:szCs w:val="16"/>
+        </w:rPr>
+        <w:t>": "696ee91cafaf537fcbad7776"</w:t>
+      </w:r>
+    </w:p>
+    <w:p>
+      <w:pPr>
+        <w:rPr>
+          <w:rFonts w:ascii="Courier New" w:hAnsi="Courier New" w:cs="Courier New"/>
+          <w:sz w:val="16"/>
+          <w:szCs w:val="16"/>
+        </w:rPr>
+      </w:pPr>
+      <w:r>
+        <w:rPr>
+          <w:rFonts w:ascii="Courier New" w:hAnsi="Courier New" w:cs="Courier New"/>
+          <w:sz w:val="16"/>
+          <w:szCs w:val="16"/>
+        </w:rPr>
+        <w:t xml:space="preserve">  },</w:t>
+      </w:r>
+    </w:p>
+    <w:p>
+      <w:pPr>
+        <w:rPr>
+          <w:rFonts w:ascii="Courier New" w:hAnsi="Courier New" w:cs="Courier New"/>
+          <w:sz w:val="16"/>
+          <w:szCs w:val="16"/>
+        </w:rPr>
+      </w:pPr>
+      <w:r>
+        <w:rPr>
+          <w:rFonts w:ascii="Courier New" w:hAnsi="Courier New" w:cs="Courier New"/>
+          <w:sz w:val="16"/>
+          <w:szCs w:val="16"/>
+        </w:rPr>
+        <w:t xml:space="preserve">  "zip": "82730",</w:t>
+      </w:r>
+    </w:p>
+    <w:p>
+      <w:pPr>
+        <w:rPr>
+          <w:rFonts w:ascii="Courier New" w:hAnsi="Courier New" w:cs="Courier New"/>
+          <w:sz w:val="16"/>
+          <w:szCs w:val="16"/>
+        </w:rPr>
+      </w:pPr>
+      <w:r>
+        <w:rPr>
+          <w:rFonts w:ascii="Courier New" w:hAnsi="Courier New" w:cs="Courier New"/>
+          <w:sz w:val="16"/>
+          <w:szCs w:val="16"/>
+        </w:rPr>
+        <w:t xml:space="preserve">  "</w:t>
+      </w:r>
+      <w:proofErr w:type="spellStart"/>
+      <w:r>
+        <w:rPr>
+          <w:rFonts w:ascii="Courier New" w:hAnsi="Courier New" w:cs="Courier New"/>
+          <w:sz w:val="16"/>
+          <w:szCs w:val="16"/>
+        </w:rPr>
+        <w:t>countyFips</w:t>
+      </w:r>
+      <w:proofErr w:type="spellEnd"/>
+      <w:r>
+        <w:rPr>
+          <w:rFonts w:ascii="Courier New" w:hAnsi="Courier New" w:cs="Courier New"/>
+          <w:sz w:val="16"/>
+          <w:szCs w:val="16"/>
+        </w:rPr>
+        <w:t>": "56045",</w:t>
+      </w:r>
+    </w:p>
+    <w:p>
+      <w:pPr>
+        <w:rPr>
+          <w:rFonts w:ascii="Courier New" w:hAnsi="Courier New" w:cs="Courier New"/>
+          <w:sz w:val="16"/>
+          <w:szCs w:val="16"/>
+        </w:rPr>
+      </w:pPr>
+      <w:r>
+        <w:rPr>
+          <w:rFonts w:ascii="Courier New" w:hAnsi="Courier New" w:cs="Courier New"/>
+          <w:sz w:val="16"/>
+          <w:szCs w:val="16"/>
+        </w:rPr>
+        <w:t xml:space="preserve">  "</w:t>
+      </w:r>
+      <w:proofErr w:type="spellStart"/>
+      <w:r>
+        <w:rPr>
+          <w:rFonts w:ascii="Courier New" w:hAnsi="Courier New" w:cs="Courier New"/>
+          <w:sz w:val="16"/>
+          <w:szCs w:val="16"/>
+        </w:rPr>
+        <w:t>countyName</w:t>
+      </w:r>
+      <w:proofErr w:type="spellEnd"/>
+      <w:r>
+        <w:rPr>
+          <w:rFonts w:ascii="Courier New" w:hAnsi="Courier New" w:cs="Courier New"/>
+          <w:sz w:val="16"/>
+          <w:szCs w:val="16"/>
+        </w:rPr>
+        <w:t>": "Weston County",</w:t>
+      </w:r>
+    </w:p>
+    <w:p>
+      <w:pPr>
+        <w:rPr>
+          <w:rFonts w:ascii="Courier New" w:hAnsi="Courier New" w:cs="Courier New"/>
+          <w:sz w:val="16"/>
+          <w:szCs w:val="16"/>
+        </w:rPr>
+      </w:pPr>
+      <w:r>
+        <w:rPr>
+          <w:rFonts w:ascii="Courier New" w:hAnsi="Courier New" w:cs="Courier New"/>
+          <w:sz w:val="16"/>
+          <w:szCs w:val="16"/>
+        </w:rPr>
+        <w:t xml:space="preserve">  "</w:t>
+      </w:r>
+      <w:proofErr w:type="spellStart"/>
+      <w:r>
+        <w:rPr>
+          <w:rFonts w:ascii="Courier New" w:hAnsi="Courier New" w:cs="Courier New"/>
+          <w:sz w:val="16"/>
+          <w:szCs w:val="16"/>
+        </w:rPr>
+        <w:t>mainCity</w:t>
+      </w:r>
+      <w:proofErr w:type="spellEnd"/>
+      <w:r>
+        <w:rPr>
+          <w:rFonts w:ascii="Courier New" w:hAnsi="Courier New" w:cs="Courier New"/>
+          <w:sz w:val="16"/>
+          <w:szCs w:val="16"/>
+        </w:rPr>
+        <w:t>": "UPTON",</w:t>
+      </w:r>
+    </w:p>
+    <w:p>
+      <w:pPr>
+        <w:rPr>
+          <w:rFonts w:ascii="Courier New" w:hAnsi="Courier New" w:cs="Courier New"/>
+          <w:sz w:val="16"/>
+          <w:szCs w:val="16"/>
+        </w:rPr>
+      </w:pPr>
+      <w:r>
+        <w:rPr>
+          <w:rFonts w:ascii="Courier New" w:hAnsi="Courier New" w:cs="Courier New"/>
+          <w:sz w:val="16"/>
+          <w:szCs w:val="16"/>
+        </w:rPr>
+        <w:t xml:space="preserve">  "state": "WY",</w:t>
+      </w:r>
+    </w:p>
+    <w:p>
+      <w:pPr>
+        <w:rPr>
+          <w:rFonts w:ascii="Courier New" w:hAnsi="Courier New" w:cs="Courier New"/>
+          <w:sz w:val="12"/>
+          <w:szCs w:val="12"/>
+        </w:rPr>
+      </w:pPr>
+      <w:r>
+        <w:rPr>
+          <w:rFonts w:ascii="Courier New" w:hAnsi="Courier New" w:cs="Courier New"/>
+          <w:sz w:val="16"/>
+          <w:szCs w:val="16"/>
+        </w:rPr>
+        <w:t xml:space="preserve">  "</w:t>
+      </w:r>
+      <w:proofErr w:type="spellStart"/>
+      <w:r>
+        <w:rPr>
+          <w:rFonts w:ascii="Courier New" w:hAnsi="Courier New" w:cs="Courier New"/>
+          <w:sz w:val="16"/>
+          <w:szCs w:val="16"/>
+        </w:rPr>
+        <w:t>percentOfZipInCounty</w:t>
+      </w:r>
+      <w:proofErr w:type="spellEnd"/>
+      <w:proofErr w:type="gramStart"/>
+      <w:r>
+        <w:rPr>
+          <w:rFonts w:ascii="Courier New" w:hAnsi="Courier New" w:cs="Courier New"/>
+          <w:sz w:val="12"/>
+          <w:szCs w:val="12"/>
+        </w:rPr>
+        <w:t>": {</w:t>
+      </w:r>
+      <w:proofErr w:type="gramEnd"/>
+      <w:r>
+        <w:rPr>
+          <w:rFonts w:ascii="Courier New" w:hAnsi="Courier New" w:cs="Courier New"/>
+          <w:sz w:val="12"/>
+          <w:szCs w:val="12"/>
+        </w:rPr>
+        <w:t>"$</w:t>
+      </w:r>
+      <w:proofErr w:type="spellStart"/>
+      <w:r>
+        <w:rPr>
+          <w:rFonts w:ascii="Courier New" w:hAnsi="Courier New" w:cs="Courier New"/>
+          <w:sz w:val="12"/>
+          <w:szCs w:val="12"/>
+        </w:rPr>
+        <w:t>numberDecimal</w:t>
+      </w:r>
+      <w:proofErr w:type="spellEnd"/>
+      <w:r>
+        <w:rPr>
+          <w:rFonts w:ascii="Courier New" w:hAnsi="Courier New" w:cs="Courier New"/>
+          <w:sz w:val="12"/>
+          <w:szCs w:val="12"/>
+        </w:rPr>
+        <w:t>": "</w:t>
+      </w:r>
+      <w:proofErr w:type="gramStart"/>
+      <w:r>
+        <w:rPr>
+          <w:rFonts w:ascii="Courier New" w:hAnsi="Courier New" w:cs="Courier New"/>
+          <w:sz w:val="12"/>
+          <w:szCs w:val="12"/>
+        </w:rPr>
+        <w:t>0.935875217"}</w:t>
+      </w:r>
+      <w:proofErr w:type="gramEnd"/>
+      <w:r>
+        <w:rPr>
+          <w:rFonts w:ascii="Courier New" w:hAnsi="Courier New" w:cs="Courier New"/>
+          <w:sz w:val="12"/>
+          <w:szCs w:val="12"/>
+        </w:rPr>
+        <w:t>,</w:t>
+      </w:r>
+    </w:p>
+    <w:p>
+      <w:pPr>
+        <w:rPr>
+          <w:rFonts w:ascii="Courier New" w:hAnsi="Courier New" w:cs="Courier New"/>
+          <w:sz w:val="16"/>
+          <w:szCs w:val="16"/>
+        </w:rPr>
+      </w:pPr>
+      <w:r>
+        <w:rPr>
+          <w:rFonts w:ascii="Courier New" w:hAnsi="Courier New" w:cs="Courier New"/>
+          <w:sz w:val="16"/>
+          <w:szCs w:val="16"/>
+        </w:rPr>
+        <w:t xml:space="preserve">  "realGDP2023": 317107000,</w:t>
+      </w:r>
+    </w:p>
+    <w:p>
+      <w:pPr>
+        <w:rPr>
+          <w:rFonts w:ascii="Courier New" w:hAnsi="Courier New" w:cs="Courier New"/>
+          <w:sz w:val="16"/>
+          <w:szCs w:val="16"/>
+        </w:rPr>
+      </w:pPr>
+      <w:r>
+        <w:rPr>
+          <w:rFonts w:ascii="Courier New" w:hAnsi="Courier New" w:cs="Courier New"/>
+          <w:sz w:val="16"/>
+          <w:szCs w:val="16"/>
+        </w:rPr>
+        <w:t xml:space="preserve">  "gdpRankInState2023": 21,</w:t>
+      </w:r>
+    </w:p>
+    <w:p>
+      <w:pPr>
+        <w:rPr>
+          <w:rFonts w:ascii="Courier New" w:hAnsi="Courier New" w:cs="Courier New"/>
+          <w:sz w:val="16"/>
+          <w:szCs w:val="16"/>
+        </w:rPr>
+      </w:pPr>
+      <w:r>
+        <w:rPr>
+          <w:rFonts w:ascii="Courier New" w:hAnsi="Courier New" w:cs="Courier New"/>
+          <w:sz w:val="16"/>
+          <w:szCs w:val="16"/>
+        </w:rPr>
+        <w:t xml:space="preserve">  "percentChange2023": 9.5,</w:t>
+      </w:r>
+    </w:p>
+    <w:p>
+      <w:pPr>
+        <w:rPr>
+          <w:rFonts w:ascii="Courier New" w:hAnsi="Courier New" w:cs="Courier New"/>
+          <w:sz w:val="16"/>
+          <w:szCs w:val="16"/>
+        </w:rPr>
+      </w:pPr>
+      <w:r>
+        <w:rPr>
+          <w:rFonts w:ascii="Courier New" w:hAnsi="Courier New" w:cs="Courier New"/>
+          <w:sz w:val="16"/>
+          <w:szCs w:val="16"/>
+        </w:rPr>
+        <w:t xml:space="preserve">  "percentChangeRankInState2023": 6</w:t>
+      </w:r>
+    </w:p>
+    <w:p>
+      <w:pPr>
+        <w:rPr>
+          <w:rFonts w:ascii="Courier New" w:hAnsi="Courier New" w:cs="Courier New"/>
+          <w:sz w:val="16"/>
+          <w:szCs w:val="16"/>
+        </w:rPr>
+      </w:pPr>
+      <w:r>
+        <w:rPr>
+          <w:rFonts w:ascii="Courier New" w:hAnsi="Courier New" w:cs="Courier New"/>
+          <w:sz w:val="16"/>
+          <w:szCs w:val="16"/>
+        </w:rPr>
+        <w:t>}</w:t>
+      </w:r>
+    </w:p>
+    <w:p>
+      <w:pPr>
+        <w:pStyle w:val="Heading5"/>
+      </w:pPr>
+      <w:r>
+        <w:t>Notes on collection:</w:t>
+      </w:r>
+    </w:p>
+    <w:p>
+      <w:r>
+        <w:t>Business rules</w:t>
+      </w:r>
+    </w:p>
+    <w:p>
+      <w:r>
+        <w:lastRenderedPageBreak/>
+        <w:t>Only if the</w:t>
+      </w:r>
+      <w:r>
+        <w:t xml:space="preserve"> </w:t>
+      </w:r>
+      <w:proofErr w:type="spellStart"/>
+      <w:r>
+        <w:t>percentOfZipInCounty</w:t>
+      </w:r>
+      <w:proofErr w:type="spellEnd"/>
+      <w:r>
+        <w:t xml:space="preserve"> can be used to determine if a zip code is wholly in one county. If this number is below 99% then it should be assumed that it is unknown based on the information </w:t>
+      </w:r>
+      <w:proofErr w:type="gramStart"/>
+      <w:r>
+        <w:t>available</w:t>
+      </w:r>
+      <w:proofErr w:type="gramEnd"/>
+      <w:r>
+        <w:t xml:space="preserve"> how to enrich the record.  </w:t>
+      </w:r>
+    </w:p>
+    <w:p>
+      <w:pPr>
+        <w:ind w:left="1080"/>
+        <w:rPr>
+          <w:rFonts w:ascii="Courier New" w:hAnsi="Courier New" w:cs="Courier New"/>
+          <w:sz w:val="16"/>
+          <w:szCs w:val="16"/>
+        </w:rPr>
+      </w:pPr>
+    </w:p>
+    <w:p>
+      <w:pPr>
+        <w:pStyle w:val="Heading4"/>
+      </w:pPr>
+      <w:r>
+        <w:t xml:space="preserve">Provider. </w:t>
+      </w:r>
+    </w:p>
+    <w:p>
+      <w:pPr>
+        <w:rPr>
+          <w:rFonts w:ascii="Courier New" w:hAnsi="Courier New" w:cs="Courier New"/>
+          <w:sz w:val="16"/>
+          <w:szCs w:val="16"/>
+        </w:rPr>
+      </w:pPr>
+      <w:r>
+        <w:t>{</w:t>
+      </w:r>
+    </w:p>
+    <w:p>
+      <w:pPr>
+        <w:rPr>
+          <w:rFonts w:ascii="Courier New" w:hAnsi="Courier New" w:cs="Courier New"/>
+          <w:sz w:val="16"/>
+          <w:szCs w:val="16"/>
+        </w:rPr>
+      </w:pPr>
+      <w:r>
+        <w:rPr>
+          <w:rFonts w:ascii="Courier New" w:hAnsi="Courier New" w:cs="Courier New"/>
+          <w:sz w:val="16"/>
+          <w:szCs w:val="16"/>
+        </w:rPr>
+        <w:t xml:space="preserve">  "_id</w:t>
+      </w:r>
+      <w:proofErr w:type="gramStart"/>
+      <w:r>
+        <w:rPr>
+          <w:rFonts w:ascii="Courier New" w:hAnsi="Courier New" w:cs="Courier New"/>
+          <w:sz w:val="16"/>
+          <w:szCs w:val="16"/>
+        </w:rPr>
+        <w:t>": {</w:t>
+      </w:r>
+      <w:proofErr w:type="gramEnd"/>
+    </w:p>
+    <w:p>
+      <w:pPr>
+        <w:rPr>
+          <w:rFonts w:ascii="Courier New" w:hAnsi="Courier New" w:cs="Courier New"/>
+          <w:sz w:val="16"/>
+          <w:szCs w:val="16"/>
+        </w:rPr>
+      </w:pPr>
+      <w:r>
+        <w:rPr>
+          <w:rFonts w:ascii="Courier New" w:hAnsi="Courier New" w:cs="Courier New"/>
+          <w:sz w:val="16"/>
+          <w:szCs w:val="16"/>
+        </w:rPr>
+        <w:t xml:space="preserve">    "$</w:t>
+      </w:r>
+      <w:proofErr w:type="spellStart"/>
+      <w:r>
+        <w:rPr>
+          <w:rFonts w:ascii="Courier New" w:hAnsi="Courier New" w:cs="Courier New"/>
+          <w:sz w:val="16"/>
+          <w:szCs w:val="16"/>
+        </w:rPr>
+        <w:t>oid</w:t>
+      </w:r>
+      <w:proofErr w:type="spellEnd"/>
+      <w:r>
+        <w:rPr>
+          <w:rFonts w:ascii="Courier New" w:hAnsi="Courier New" w:cs="Courier New"/>
+          <w:sz w:val="16"/>
+          <w:szCs w:val="16"/>
+        </w:rPr>
+        <w:t>": "695b3c6400b2277bd194fb42"</w:t>
+      </w:r>
+    </w:p>
+    <w:p>
+      <w:pPr>
+        <w:rPr>
+          <w:rFonts w:ascii="Courier New" w:hAnsi="Courier New" w:cs="Courier New"/>
+          <w:sz w:val="16"/>
+          <w:szCs w:val="16"/>
+        </w:rPr>
+      </w:pPr>
+      <w:r>
+        <w:rPr>
+          <w:rFonts w:ascii="Courier New" w:hAnsi="Courier New" w:cs="Courier New"/>
+          <w:sz w:val="16"/>
+          <w:szCs w:val="16"/>
+        </w:rPr>
+        <w:t xml:space="preserve">  },</w:t>
+      </w:r>
+    </w:p>
+    <w:p>
+      <w:pPr>
+        <w:rPr>
+          <w:rFonts w:ascii="Courier New" w:hAnsi="Courier New" w:cs="Courier New"/>
+          <w:sz w:val="16"/>
+          <w:szCs w:val="16"/>
+        </w:rPr>
+      </w:pPr>
+      <w:r>
+        <w:rPr>
+          <w:rFonts w:ascii="Courier New" w:hAnsi="Courier New" w:cs="Courier New"/>
+          <w:sz w:val="16"/>
+          <w:szCs w:val="16"/>
+        </w:rPr>
+        <w:t xml:space="preserve">  "NPI": "1679783054",</w:t>
+      </w:r>
+    </w:p>
+    <w:p>
+      <w:pPr>
+        <w:rPr>
+          <w:rFonts w:ascii="Courier New" w:hAnsi="Courier New" w:cs="Courier New"/>
+          <w:sz w:val="16"/>
+          <w:szCs w:val="16"/>
+        </w:rPr>
+      </w:pPr>
+      <w:r>
+        <w:rPr>
+          <w:rFonts w:ascii="Courier New" w:hAnsi="Courier New" w:cs="Courier New"/>
+          <w:sz w:val="16"/>
+          <w:szCs w:val="16"/>
+        </w:rPr>
+        <w:t xml:space="preserve">  "Entity Type Code": "1",</w:t>
+      </w:r>
+    </w:p>
+    <w:p>
+      <w:pPr>
+        <w:rPr>
+          <w:rFonts w:ascii="Courier New" w:hAnsi="Courier New" w:cs="Courier New"/>
+          <w:sz w:val="16"/>
+          <w:szCs w:val="16"/>
+        </w:rPr>
+      </w:pPr>
+      <w:r>
+        <w:rPr>
+          <w:rFonts w:ascii="Courier New" w:hAnsi="Courier New" w:cs="Courier New"/>
+          <w:sz w:val="16"/>
+          <w:szCs w:val="16"/>
+        </w:rPr>
+        <w:t xml:space="preserve">  "Provider Organization Name (Legal Business Name)": null,</w:t>
+      </w:r>
+    </w:p>
+    <w:p>
+      <w:pPr>
+        <w:rPr>
+          <w:rFonts w:ascii="Courier New" w:hAnsi="Courier New" w:cs="Courier New"/>
+          <w:sz w:val="16"/>
+          <w:szCs w:val="16"/>
+        </w:rPr>
+      </w:pPr>
+      <w:r>
+        <w:rPr>
+          <w:rFonts w:ascii="Courier New" w:hAnsi="Courier New" w:cs="Courier New"/>
+          <w:sz w:val="16"/>
+          <w:szCs w:val="16"/>
+        </w:rPr>
+        <w:t xml:space="preserve">  "Provider Last Name (Legal Name)": "ELLIOTT-RENO",</w:t>
+      </w:r>
+    </w:p>
+    <w:p>
+      <w:pPr>
+        <w:rPr>
+          <w:rFonts w:ascii="Courier New" w:hAnsi="Courier New" w:cs="Courier New"/>
+          <w:sz w:val="16"/>
+          <w:szCs w:val="16"/>
+        </w:rPr>
+      </w:pPr>
+      <w:r>
+        <w:rPr>
+          <w:rFonts w:ascii="Courier New" w:hAnsi="Courier New" w:cs="Courier New"/>
+          <w:sz w:val="16"/>
+          <w:szCs w:val="16"/>
+        </w:rPr>
+        <w:t xml:space="preserve">  "Provider First Name": "ROXANNA",</w:t>
+      </w:r>
+    </w:p>
+    <w:p>
+      <w:pPr>
+        <w:rPr>
+          <w:rFonts w:ascii="Courier New" w:hAnsi="Courier New" w:cs="Courier New"/>
+          <w:sz w:val="16"/>
+          <w:szCs w:val="16"/>
+        </w:rPr>
+      </w:pPr>
+      <w:r>
+        <w:rPr>
+          <w:rFonts w:ascii="Courier New" w:hAnsi="Courier New" w:cs="Courier New"/>
+          <w:sz w:val="16"/>
+          <w:szCs w:val="16"/>
+        </w:rPr>
+        <w:t xml:space="preserve">  "Provider Middle Name": "R",</w:t>
+      </w:r>
+    </w:p>
+    <w:p>
+      <w:pPr>
+        <w:rPr>
+          <w:rFonts w:ascii="Courier New" w:hAnsi="Courier New" w:cs="Courier New"/>
+          <w:sz w:val="16"/>
+          <w:szCs w:val="16"/>
+        </w:rPr>
+      </w:pPr>
+      <w:r>
+        <w:rPr>
+          <w:rFonts w:ascii="Courier New" w:hAnsi="Courier New" w:cs="Courier New"/>
+          <w:sz w:val="16"/>
+          <w:szCs w:val="16"/>
+        </w:rPr>
+        <w:t xml:space="preserve">  "Provider Name Prefix Text": null,</w:t>
+      </w:r>
+    </w:p>
+    <w:p>
+      <w:pPr>
+        <w:rPr>
+          <w:rFonts w:ascii="Courier New" w:hAnsi="Courier New" w:cs="Courier New"/>
+          <w:sz w:val="16"/>
+          <w:szCs w:val="16"/>
+        </w:rPr>
+      </w:pPr>
+      <w:r>
+        <w:rPr>
+          <w:rFonts w:ascii="Courier New" w:hAnsi="Courier New" w:cs="Courier New"/>
+          <w:sz w:val="16"/>
+          <w:szCs w:val="16"/>
+        </w:rPr>
+        <w:t xml:space="preserve">  "Provider Name Suffix Text": null,</w:t>
+      </w:r>
+    </w:p>
+    <w:p>
+      <w:pPr>
+        <w:rPr>
+          <w:rFonts w:ascii="Courier New" w:hAnsi="Courier New" w:cs="Courier New"/>
+          <w:sz w:val="16"/>
+          <w:szCs w:val="16"/>
+        </w:rPr>
+      </w:pPr>
+      <w:r>
+        <w:rPr>
+          <w:rFonts w:ascii="Courier New" w:hAnsi="Courier New" w:cs="Courier New"/>
+          <w:sz w:val="16"/>
+          <w:szCs w:val="16"/>
+        </w:rPr>
+        <w:t xml:space="preserve">  "Provider Credential Text": "R.N.",</w:t>
+      </w:r>
+    </w:p>
+    <w:p>
+      <w:pPr>
+        <w:rPr>
+          <w:rFonts w:ascii="Courier New" w:hAnsi="Courier New" w:cs="Courier New"/>
+          <w:sz w:val="16"/>
+          <w:szCs w:val="16"/>
+        </w:rPr>
+      </w:pPr>
+      <w:r>
+        <w:rPr>
+          <w:rFonts w:ascii="Courier New" w:hAnsi="Courier New" w:cs="Courier New"/>
+          <w:sz w:val="16"/>
+          <w:szCs w:val="16"/>
+        </w:rPr>
+        <w:t xml:space="preserve">  "Provider First Line Business Mailing Address": "PO BOX 436",</w:t>
+      </w:r>
+    </w:p>
+    <w:p>
+      <w:pPr>
+        <w:rPr>
+          <w:rFonts w:ascii="Courier New" w:hAnsi="Courier New" w:cs="Courier New"/>
+          <w:sz w:val="16"/>
+          <w:szCs w:val="16"/>
+        </w:rPr>
+      </w:pPr>
+      <w:r>
+        <w:rPr>
+          <w:rFonts w:ascii="Courier New" w:hAnsi="Courier New" w:cs="Courier New"/>
+          <w:sz w:val="16"/>
+          <w:szCs w:val="16"/>
+        </w:rPr>
+        <w:t xml:space="preserve">  "Provider Second Line Business Mailing Address": null,</w:t>
+      </w:r>
+    </w:p>
+    <w:p>
+      <w:pPr>
+        <w:rPr>
+          <w:rFonts w:ascii="Courier New" w:hAnsi="Courier New" w:cs="Courier New"/>
+          <w:sz w:val="16"/>
+          <w:szCs w:val="16"/>
+        </w:rPr>
+      </w:pPr>
+      <w:r>
+        <w:rPr>
+          <w:rFonts w:ascii="Courier New" w:hAnsi="Courier New" w:cs="Courier New"/>
+          <w:sz w:val="16"/>
+          <w:szCs w:val="16"/>
+        </w:rPr>
+        <w:t xml:space="preserve">  "Provider Business Mailing Address City Name": "UPTON",</w:t>
+      </w:r>
+    </w:p>
+    <w:p>
+      <w:pPr>
+        <w:rPr>
+          <w:rFonts w:ascii="Courier New" w:hAnsi="Courier New" w:cs="Courier New"/>
+          <w:sz w:val="16"/>
+          <w:szCs w:val="16"/>
+        </w:rPr>
+      </w:pPr>
+      <w:r>
+        <w:rPr>
+          <w:rFonts w:ascii="Courier New" w:hAnsi="Courier New" w:cs="Courier New"/>
+          <w:sz w:val="16"/>
+          <w:szCs w:val="16"/>
+        </w:rPr>
+        <w:t xml:space="preserve">  "Provider Business Mailing Address State Name": "WY",</w:t>
+      </w:r>
+    </w:p>
+    <w:p>
+      <w:pPr>
+        <w:rPr>
+          <w:rFonts w:ascii="Courier New" w:hAnsi="Courier New" w:cs="Courier New"/>
+          <w:sz w:val="16"/>
+          <w:szCs w:val="16"/>
+        </w:rPr>
+      </w:pPr>
+      <w:r>
+        <w:rPr>
+          <w:rFonts w:ascii="Courier New" w:hAnsi="Courier New" w:cs="Courier New"/>
+          <w:sz w:val="16"/>
+          <w:szCs w:val="16"/>
+        </w:rPr>
+        <w:t xml:space="preserve">  "Provider Business Mailing Address Postal Code": "82730",</w:t>
+      </w:r>
+    </w:p>
+    <w:p>
+      <w:pPr>
+        <w:rPr>
+          <w:rFonts w:ascii="Courier New" w:hAnsi="Courier New" w:cs="Courier New"/>
+          <w:sz w:val="16"/>
+          <w:szCs w:val="16"/>
+        </w:rPr>
+      </w:pPr>
+      <w:r>
+        <w:rPr>
+          <w:rFonts w:ascii="Courier New" w:hAnsi="Courier New" w:cs="Courier New"/>
+          <w:sz w:val="16"/>
+          <w:szCs w:val="16"/>
+        </w:rPr>
+        <w:t xml:space="preserve">  "Provider Business Mailing Address Telephone Number": "3076890219",</w:t>
+      </w:r>
+    </w:p>
+    <w:p>
+      <w:pPr>
+        <w:rPr>
+          <w:rFonts w:ascii="Courier New" w:hAnsi="Courier New" w:cs="Courier New"/>
+          <w:sz w:val="16"/>
+          <w:szCs w:val="16"/>
+        </w:rPr>
+      </w:pPr>
+      <w:r>
+        <w:rPr>
+          <w:rFonts w:ascii="Courier New" w:hAnsi="Courier New" w:cs="Courier New"/>
+          <w:sz w:val="16"/>
+          <w:szCs w:val="16"/>
+        </w:rPr>
+        <w:t xml:space="preserve">  "Provider First Line Business Practice Location Address": "1445 E A ST",</w:t>
+      </w:r>
+    </w:p>
+    <w:p>
+      <w:pPr>
+        <w:rPr>
+          <w:rFonts w:ascii="Courier New" w:hAnsi="Courier New" w:cs="Courier New"/>
+          <w:sz w:val="16"/>
+          <w:szCs w:val="16"/>
+        </w:rPr>
+      </w:pPr>
+      <w:r>
+        <w:rPr>
+          <w:rFonts w:ascii="Courier New" w:hAnsi="Courier New" w:cs="Courier New"/>
+          <w:sz w:val="16"/>
+          <w:szCs w:val="16"/>
+        </w:rPr>
+        <w:t xml:space="preserve">  "Provider Second Line Business Practice Location Address": null,</w:t>
+      </w:r>
+    </w:p>
+    <w:p>
+      <w:pPr>
+        <w:rPr>
+          <w:rFonts w:ascii="Courier New" w:hAnsi="Courier New" w:cs="Courier New"/>
+          <w:sz w:val="16"/>
+          <w:szCs w:val="16"/>
+        </w:rPr>
+      </w:pPr>
+      <w:r>
+        <w:rPr>
+          <w:rFonts w:ascii="Courier New" w:hAnsi="Courier New" w:cs="Courier New"/>
+          <w:sz w:val="16"/>
+          <w:szCs w:val="16"/>
+        </w:rPr>
+        <w:t xml:space="preserve">  "Provider Business Practice Location Address City Name": "CASPER",</w:t>
+      </w:r>
+    </w:p>
+    <w:p>
+      <w:pPr>
+        <w:rPr>
+          <w:rFonts w:ascii="Courier New" w:hAnsi="Courier New" w:cs="Courier New"/>
+          <w:sz w:val="16"/>
+          <w:szCs w:val="16"/>
+        </w:rPr>
+      </w:pPr>
+      <w:r>
+        <w:rPr>
+          <w:rFonts w:ascii="Courier New" w:hAnsi="Courier New" w:cs="Courier New"/>
+          <w:sz w:val="16"/>
+          <w:szCs w:val="16"/>
+        </w:rPr>
+        <w:t xml:space="preserve">  "Provider Business Practice Location Address State Name": "WY",</w:t>
+      </w:r>
+    </w:p>
+    <w:p>
+      <w:pPr>
+        <w:rPr>
+          <w:rFonts w:ascii="Courier New" w:hAnsi="Courier New" w:cs="Courier New"/>
+          <w:sz w:val="16"/>
+          <w:szCs w:val="16"/>
+        </w:rPr>
+      </w:pPr>
+      <w:r>
+        <w:rPr>
+          <w:rFonts w:ascii="Courier New" w:hAnsi="Courier New" w:cs="Courier New"/>
+          <w:sz w:val="16"/>
+          <w:szCs w:val="16"/>
+        </w:rPr>
+        <w:t xml:space="preserve">  "Provider Business Practice Location Address Postal Code": "82601",</w:t>
+      </w:r>
+    </w:p>
+    <w:p>
+      <w:pPr>
+        <w:rPr>
+          <w:rFonts w:ascii="Courier New" w:hAnsi="Courier New" w:cs="Courier New"/>
+          <w:sz w:val="16"/>
+          <w:szCs w:val="16"/>
+        </w:rPr>
+      </w:pPr>
+      <w:r>
+        <w:rPr>
+          <w:rFonts w:ascii="Courier New" w:hAnsi="Courier New" w:cs="Courier New"/>
+          <w:sz w:val="16"/>
+          <w:szCs w:val="16"/>
+        </w:rPr>
+        <w:t xml:space="preserve">  "Provider Sex Code": "F",</w:t>
+      </w:r>
+    </w:p>
+    <w:p>
+      <w:pPr>
+        <w:rPr>
+          <w:rFonts w:ascii="Courier New" w:hAnsi="Courier New" w:cs="Courier New"/>
+          <w:sz w:val="16"/>
+          <w:szCs w:val="16"/>
+        </w:rPr>
+      </w:pPr>
+      <w:r>
+        <w:rPr>
+          <w:rFonts w:ascii="Courier New" w:hAnsi="Courier New" w:cs="Courier New"/>
+          <w:sz w:val="16"/>
+          <w:szCs w:val="16"/>
+        </w:rPr>
+        <w:t xml:space="preserve">  "Healthcare Provider Taxonomy Code_1": "163W00000X",</w:t>
+      </w:r>
+    </w:p>
+    <w:p>
+      <w:pPr>
+        <w:rPr>
+          <w:rFonts w:ascii="Courier New" w:hAnsi="Courier New" w:cs="Courier New"/>
+          <w:sz w:val="16"/>
+          <w:szCs w:val="16"/>
+        </w:rPr>
+      </w:pPr>
+      <w:r>
+        <w:rPr>
+          <w:rFonts w:ascii="Courier New" w:hAnsi="Courier New" w:cs="Courier New"/>
+          <w:sz w:val="16"/>
+          <w:szCs w:val="16"/>
+        </w:rPr>
+        <w:t xml:space="preserve">  "Provider License Number_1": "R029543",</w:t>
+      </w:r>
+    </w:p>
+    <w:p>
+      <w:pPr>
+        <w:rPr>
+          <w:rFonts w:ascii="Courier New" w:hAnsi="Courier New" w:cs="Courier New"/>
+          <w:sz w:val="16"/>
+          <w:szCs w:val="16"/>
+        </w:rPr>
+      </w:pPr>
+      <w:r>
+        <w:rPr>
+          <w:rFonts w:ascii="Courier New" w:hAnsi="Courier New" w:cs="Courier New"/>
+          <w:sz w:val="16"/>
+          <w:szCs w:val="16"/>
+        </w:rPr>
+        <w:t xml:space="preserve">  "Provider License Number State Code_1": "SD",</w:t>
+      </w:r>
+    </w:p>
+    <w:p>
+      <w:pPr>
+        <w:rPr>
+          <w:rFonts w:ascii="Courier New" w:hAnsi="Courier New" w:cs="Courier New"/>
+          <w:sz w:val="16"/>
+          <w:szCs w:val="16"/>
+        </w:rPr>
+      </w:pPr>
+      <w:r>
+        <w:rPr>
+          <w:rFonts w:ascii="Courier New" w:hAnsi="Courier New" w:cs="Courier New"/>
+          <w:sz w:val="16"/>
+          <w:szCs w:val="16"/>
+        </w:rPr>
+        <w:t xml:space="preserve">  "Healthcare Provider Primary Taxonomy Switch_1": "N",</w:t>
+      </w:r>
+    </w:p>
+    <w:p>
+      <w:pPr>
+        <w:rPr>
+          <w:rFonts w:ascii="Courier New" w:hAnsi="Courier New" w:cs="Courier New"/>
+          <w:sz w:val="16"/>
+          <w:szCs w:val="16"/>
+        </w:rPr>
+      </w:pPr>
+      <w:r>
+        <w:rPr>
+          <w:rFonts w:ascii="Courier New" w:hAnsi="Courier New" w:cs="Courier New"/>
+          <w:sz w:val="16"/>
+          <w:szCs w:val="16"/>
+        </w:rPr>
+        <w:lastRenderedPageBreak/>
+        <w:t xml:space="preserve">  "Healthcare Provider Taxonomy Code_2": "163WC0200X",</w:t>
+      </w:r>
+    </w:p>
+    <w:p>
+      <w:pPr>
+        <w:rPr>
+          <w:rFonts w:ascii="Courier New" w:hAnsi="Courier New" w:cs="Courier New"/>
+          <w:sz w:val="16"/>
+          <w:szCs w:val="16"/>
+        </w:rPr>
+      </w:pPr>
+      <w:r>
+        <w:rPr>
+          <w:rFonts w:ascii="Courier New" w:hAnsi="Courier New" w:cs="Courier New"/>
+          <w:sz w:val="16"/>
+          <w:szCs w:val="16"/>
+        </w:rPr>
+        <w:t xml:space="preserve">  "Is Sole Proprietor": "Y"</w:t>
+      </w:r>
+    </w:p>
+    <w:p>
+      <w:pPr>
+        <w:rPr>
+          <w:rFonts w:ascii="Courier New" w:hAnsi="Courier New" w:cs="Courier New"/>
+          <w:sz w:val="16"/>
+          <w:szCs w:val="16"/>
+        </w:rPr>
+      </w:pPr>
+      <w:r>
+        <w:rPr>
+          <w:rFonts w:ascii="Courier New" w:hAnsi="Courier New" w:cs="Courier New"/>
+          <w:sz w:val="16"/>
+          <w:szCs w:val="16"/>
+        </w:rPr>
+        <w:t>}</w:t>
+      </w:r>
+    </w:p>
+    <w:p>
+      <w:pPr>
+        <w:pStyle w:val="Heading5"/>
+      </w:pPr>
+      <w:r>
+        <w:t>Notes on the collection</w:t>
+      </w:r>
+    </w:p>
+    <w:p>
+      <w:r>
+        <w:t>Business rule for matching zip codes</w:t>
+      </w:r>
+    </w:p>
+    <w:p>
+      <w:r>
+        <w:t xml:space="preserve">When matching a zip from the </w:t>
+      </w:r>
+      <w:r>
+        <w:t>County ZipEnriched_GDP</w:t>
+      </w:r>
+      <w:r>
+        <w:t xml:space="preserve"> table, the practice location shall be preferred, but </w:t>
+      </w:r>
+      <w:r>
+        <w:t xml:space="preserve">when </w:t>
+      </w:r>
+      <w:r>
+        <w:t>the zip from the practice location is null, then use the billing location</w:t>
+      </w:r>
+      <w:r>
+        <w:t xml:space="preserve"> zip</w:t>
+      </w:r>
+      <w:r>
+        <w:t xml:space="preserve">. </w:t>
+      </w:r>
+      <w:r>
+        <w:t xml:space="preserve">If there </w:t>
+      </w:r>
+      <w:proofErr w:type="gramStart"/>
+      <w:r>
+        <w:t>a practice</w:t>
+      </w:r>
+      <w:proofErr w:type="gramEnd"/>
+      <w:r>
+        <w:t xml:space="preserve"> location </w:t>
+      </w:r>
+      <w:proofErr w:type="gramStart"/>
+      <w:r>
+        <w:t>zip exists</w:t>
+      </w:r>
+      <w:proofErr w:type="gramEnd"/>
+      <w:r>
+        <w:t xml:space="preserve">, then do not use the billing location zip. </w:t>
+      </w:r>
+    </w:p>
+    <w:p>
+      <w:pPr>
+        <w:pStyle w:val="Heading4"/>
+      </w:pPr>
+      <w:r>
+        <w:t>Class specification</w:t>
+      </w:r>
+    </w:p>
+    <w:p>
+      <w:r>
+        <w:t xml:space="preserve">Class name: </w:t>
+      </w:r>
+      <w:r>
+        <w:t>‘</w:t>
+      </w:r>
+      <w:proofErr w:type="spellStart"/>
+      <w:r>
+        <w:t>EnrichProviderRecordsWithCountyData</w:t>
+      </w:r>
+      <w:proofErr w:type="spellEnd"/>
+      <w:r>
+        <w:t>’</w:t>
+      </w:r>
+    </w:p>
+    <w:p>
+      <w:r>
+        <w:t>Constructor arguments:</w:t>
+      </w:r>
+    </w:p>
+    <w:p>
+      <w:pPr>
+        <w:pStyle w:val="ListParagraph"/>
+        <w:numPr>
+          <w:ilvl w:val="0"/>
+          <w:numId w:val="25"/>
+        </w:numPr>
+      </w:pPr>
+      <w:proofErr w:type="spellStart"/>
+      <w:r>
+        <w:t>arg</w:t>
+      </w:r>
+      <w:r>
+        <w:t>MongoDataBaseClient</w:t>
+      </w:r>
+      <w:proofErr w:type="spellEnd"/>
+      <w:r>
+        <w:t xml:space="preserve">: A connected </w:t>
+      </w:r>
+      <w:proofErr w:type="spellStart"/>
+      <w:r>
+        <w:t>MongoDBConnection</w:t>
+      </w:r>
+      <w:proofErr w:type="spellEnd"/>
+      <w:r>
+        <w:t>.</w:t>
+      </w:r>
+    </w:p>
+    <w:p>
+      <w:pPr>
+        <w:pStyle w:val="ListParagraph"/>
+        <w:numPr>
+          <w:ilvl w:val="0"/>
+          <w:numId w:val="25"/>
+        </w:numPr>
+      </w:pPr>
+      <w:proofErr w:type="spellStart"/>
+      <w:r>
+        <w:t>arg</w:t>
+      </w:r>
+      <w:r>
+        <w:t>Database</w:t>
+      </w:r>
+      <w:proofErr w:type="spellEnd"/>
+      <w:r>
+        <w:t xml:space="preserve"> Name</w:t>
+      </w:r>
+      <w:r>
+        <w:t xml:space="preserve">, the name of the </w:t>
+      </w:r>
+      <w:r>
+        <w:t>database</w:t>
+      </w:r>
+      <w:r>
+        <w:t xml:space="preserve"> that hosts the collections to be operated on</w:t>
+      </w:r>
+      <w:r>
+        <w:t xml:space="preserve">: </w:t>
+      </w:r>
+      <w:proofErr w:type="gramStart"/>
+      <w:r>
+        <w:t>Default: ‘</w:t>
+      </w:r>
+      <w:proofErr w:type="gramEnd"/>
+      <w:r>
+        <w:t>PublicHealthData’</w:t>
+      </w:r>
+    </w:p>
+    <w:p>
+      <w:pPr>
+        <w:pStyle w:val="ListParagraph"/>
+        <w:numPr>
+          <w:ilvl w:val="0"/>
+          <w:numId w:val="25"/>
+        </w:numPr>
+      </w:pPr>
+      <w:r>
+        <w:t>argProviderCollectionName</w:t>
+      </w:r>
+      <w:r>
+        <w:t>: Default ‘Provider’</w:t>
+      </w:r>
+    </w:p>
+    <w:p>
+      <w:pPr>
+        <w:pStyle w:val="ListParagraph"/>
+        <w:numPr>
+          <w:ilvl w:val="0"/>
+          <w:numId w:val="25"/>
+        </w:numPr>
+      </w:pPr>
+      <w:r>
+        <w:t>argZipCountyEnrichmentCollectionName</w:t>
+      </w:r>
+      <w:r>
+        <w:t>: Default ‘</w:t>
+      </w:r>
+      <w:r>
+        <w:t>CountyZipEnriched_GDP</w:t>
+      </w:r>
+      <w:r>
+        <w:t>’</w:t>
+      </w:r>
+      <w:r>
+        <w:t xml:space="preserve"> </w:t>
+      </w:r>
+      <w:r>
+        <w:t xml:space="preserve"> </w:t>
+      </w:r>
+    </w:p>
+    <w:p>
+      <w:pPr>
+        <w:pStyle w:val="ListParagraph"/>
+        <w:numPr>
+          <w:ilvl w:val="0"/>
+          <w:numId w:val="25"/>
+        </w:numPr>
+      </w:pPr>
+      <w:proofErr w:type="spellStart"/>
+      <w:r>
+        <w:t>argEnrirchedProviderCollectionName</w:t>
+      </w:r>
+      <w:proofErr w:type="spellEnd"/>
+      <w:r>
+        <w:t xml:space="preserve">: </w:t>
+      </w:r>
+      <w:proofErr w:type="spellStart"/>
+      <w:r>
+        <w:t>Defalut</w:t>
+      </w:r>
+      <w:proofErr w:type="spellEnd"/>
+      <w:r>
+        <w:t>, ‘</w:t>
+      </w:r>
+      <w:proofErr w:type="spellStart"/>
+      <w:r>
+        <w:t>EnrichedProvider</w:t>
+      </w:r>
+      <w:proofErr w:type="spellEnd"/>
+      <w:r>
+        <w:t>’</w:t>
+      </w:r>
+    </w:p>
+    <w:p>
+      <w:r>
+        <w:t>The class upon construction will do the following:</w:t>
+      </w:r>
+    </w:p>
+    <w:p>
+      <w:pPr>
+        <w:pStyle w:val="ListParagraph"/>
+        <w:numPr>
+          <w:ilvl w:val="0"/>
+          <w:numId w:val="26"/>
+        </w:numPr>
+      </w:pPr>
+      <w:r>
+        <w:t xml:space="preserve">arguments to the constructor will all be assigned to instance variables of the class. </w:t>
+      </w:r>
+    </w:p>
+    <w:p>
+      <w:pPr>
+        <w:pStyle w:val="ListParagraph"/>
+        <w:numPr>
+          <w:ilvl w:val="1"/>
+          <w:numId w:val="26"/>
+        </w:numPr>
+      </w:pPr>
+      <w:r>
+        <w:t xml:space="preserve">The </w:t>
+      </w:r>
+      <w:proofErr w:type="spellStart"/>
+      <w:r>
+        <w:t>arg</w:t>
+      </w:r>
+      <w:proofErr w:type="spellEnd"/>
+      <w:r>
+        <w:t xml:space="preserve"> collection names will be used to create class variables of type: </w:t>
+      </w:r>
+      <w:proofErr w:type="spellStart"/>
+      <w:proofErr w:type="gramStart"/>
+      <w:r>
+        <w:t>pymongo.collection</w:t>
+      </w:r>
+      <w:proofErr w:type="gramEnd"/>
+      <w:r>
+        <w:t>.</w:t>
+      </w:r>
+      <w:r>
+        <w:rPr>
+          <w:b/>
+          <w:bCs/>
+        </w:rPr>
+        <w:t>Collection</w:t>
+      </w:r>
+      <w:proofErr w:type="spellEnd"/>
+      <w:r>
+        <w:t xml:space="preserve"> and the collections that have those names will be invoked so that the right collection object is associated with each variable. </w:t>
+      </w:r>
+    </w:p>
+    <w:p>
+      <w:pPr>
+        <w:pStyle w:val="ListParagraph"/>
+        <w:numPr>
+          <w:ilvl w:val="2"/>
+          <w:numId w:val="26"/>
+        </w:numPr>
+      </w:pPr>
+      <w:r>
+        <w:t xml:space="preserve">If </w:t>
+      </w:r>
+      <w:r>
+        <w:t>the collection instantiated with ‘</w:t>
+      </w:r>
+      <w:proofErr w:type="spellStart"/>
+      <w:r>
+        <w:t>argEnrirchedProviderCollectionName</w:t>
+      </w:r>
+      <w:proofErr w:type="spellEnd"/>
+      <w:r>
+        <w:t xml:space="preserve">’ exists it shall be emptied. </w:t>
+      </w:r>
+    </w:p>
+    <w:p>
+      <w:pPr>
+        <w:pStyle w:val="ListParagraph"/>
+        <w:numPr>
+          <w:ilvl w:val="1"/>
+          <w:numId w:val="26"/>
+        </w:numPr>
+      </w:pPr>
+      <w:r>
+        <w:t xml:space="preserve">The database name is used for scoping and can be stored as an implementation detail. </w:t>
+      </w:r>
+    </w:p>
+    <w:p>
+      <w:pPr>
+        <w:pStyle w:val="ListParagraph"/>
+        <w:numPr>
+          <w:ilvl w:val="1"/>
+          <w:numId w:val="26"/>
+        </w:numPr>
+      </w:pPr>
+      <w:r>
+        <w:t xml:space="preserve">The database connection should be stored as a class variable. </w:t>
+      </w:r>
+    </w:p>
+    <w:p>
+      <w:pPr>
+        <w:pStyle w:val="ListParagraph"/>
+        <w:numPr>
+          <w:ilvl w:val="0"/>
+          <w:numId w:val="26"/>
+        </w:numPr>
+      </w:pPr>
+      <w:r>
+        <w:rPr>
+          <w:sz w:val="20"/>
+          <w:szCs w:val="20"/>
+        </w:rPr>
+        <w:t xml:space="preserve">If the collections </w:t>
+      </w:r>
+      <w:r>
+        <w:rPr>
+          <w:sz w:val="20"/>
+          <w:szCs w:val="20"/>
+        </w:rPr>
+        <w:t>argProviderCollectionName</w:t>
+      </w:r>
+      <w:r>
+        <w:rPr>
+          <w:sz w:val="20"/>
+          <w:szCs w:val="20"/>
+        </w:rPr>
+        <w:t xml:space="preserve"> or </w:t>
+      </w:r>
+      <w:r>
+        <w:rPr>
+          <w:sz w:val="20"/>
+          <w:szCs w:val="20"/>
+        </w:rPr>
+        <w:t>argZipCountyEnrichmentCollectionName</w:t>
+      </w:r>
+      <w:r>
+        <w:t xml:space="preserve"> are empty throw an exception with an appropriate error message. Handle other unexpected fatal issues by throwing an exception with an appropriate message. </w:t>
+      </w:r>
+    </w:p>
+    <w:p>
+      <w:pPr>
+        <w:pStyle w:val="ListParagraph"/>
+        <w:numPr>
+          <w:ilvl w:val="0"/>
+          <w:numId w:val="26"/>
+        </w:numPr>
+      </w:pPr>
+      <w:r>
+        <w:t xml:space="preserve">Query the collection </w:t>
+      </w:r>
+      <w:proofErr w:type="spellStart"/>
+      <w:r>
+        <w:t>associaterd</w:t>
+      </w:r>
+      <w:proofErr w:type="spellEnd"/>
+      <w:r>
+        <w:t xml:space="preserve"> with </w:t>
+      </w:r>
+      <w:r>
+        <w:t>argZipCountyEnrichmentCollectionName</w:t>
+      </w:r>
+      <w:r>
+        <w:t xml:space="preserve"> and get the complete unique set of zip codes and put each </w:t>
+      </w:r>
+      <w:proofErr w:type="spellStart"/>
+      <w:r>
+        <w:t>zipcode</w:t>
+      </w:r>
+      <w:proofErr w:type="spellEnd"/>
+      <w:r>
+        <w:t xml:space="preserve"> ordered </w:t>
+      </w:r>
+      <w:proofErr w:type="spellStart"/>
+      <w:r>
+        <w:t>assending</w:t>
+      </w:r>
+      <w:proofErr w:type="spellEnd"/>
+      <w:r>
+        <w:t xml:space="preserve"> </w:t>
+      </w:r>
+      <w:r>
+        <w:lastRenderedPageBreak/>
+        <w:t xml:space="preserve">as a member of a </w:t>
+      </w:r>
+      <w:r>
+        <w:t>container</w:t>
+      </w:r>
+      <w:r>
+        <w:t xml:space="preserve"> that will be a class variable. </w:t>
+      </w:r>
+      <w:r>
+        <w:t xml:space="preserve">Pick the best possible container type based on the specification below. </w:t>
+      </w:r>
+    </w:p>
+    <w:p>
+      <w:pPr>
+        <w:pStyle w:val="ListParagraph"/>
+        <w:numPr>
+          <w:ilvl w:val="0"/>
+          <w:numId w:val="26"/>
+        </w:numPr>
+      </w:pPr>
+      <w:r>
+        <w:t xml:space="preserve">Create a class Variable of type String, </w:t>
+      </w:r>
+      <w:proofErr w:type="spellStart"/>
+      <w:r>
+        <w:t>namedNextZipCode</w:t>
+      </w:r>
+      <w:proofErr w:type="spellEnd"/>
+      <w:r>
+        <w:t xml:space="preserve">, put the first member of the list’s value as the value of this variable. </w:t>
+      </w:r>
+    </w:p>
+    <w:p>
+      <w:pPr>
+        <w:pStyle w:val="Heading4"/>
+      </w:pPr>
+      <w:r>
+        <w:t>Class’s behavior:</w:t>
+      </w:r>
+    </w:p>
+    <w:p>
+      <w:pPr>
+        <w:pStyle w:val="ListParagraph"/>
+        <w:numPr>
+          <w:ilvl w:val="0"/>
+          <w:numId w:val="27"/>
+        </w:numPr>
+      </w:pPr>
+      <w:r>
+        <w:t>Function</w:t>
+      </w:r>
+    </w:p>
+    <w:p>
+      <w:pPr>
+        <w:pStyle w:val="ListParagraph"/>
+        <w:numPr>
+          <w:ilvl w:val="1"/>
+          <w:numId w:val="27"/>
+        </w:numPr>
+      </w:pPr>
+      <w:r>
+        <w:t xml:space="preserve">Name: </w:t>
+      </w:r>
+      <w:proofErr w:type="spellStart"/>
+      <w:r>
+        <w:t>GetProvidersByZip</w:t>
+      </w:r>
+      <w:proofErr w:type="spellEnd"/>
+      <w:r>
+        <w:t xml:space="preserve"> </w:t>
+      </w:r>
+    </w:p>
+    <w:p>
+      <w:pPr>
+        <w:pStyle w:val="ListParagraph"/>
+        <w:numPr>
+          <w:ilvl w:val="1"/>
+          <w:numId w:val="27"/>
+        </w:numPr>
+      </w:pPr>
+      <w:proofErr w:type="spellStart"/>
+      <w:r>
+        <w:t>Agument</w:t>
+      </w:r>
+      <w:proofErr w:type="spellEnd"/>
+      <w:r>
+        <w:t xml:space="preserve"> ‘</w:t>
+      </w:r>
+      <w:proofErr w:type="spellStart"/>
+      <w:r>
+        <w:t>ArgZip</w:t>
+      </w:r>
+      <w:proofErr w:type="spellEnd"/>
+      <w:r>
+        <w:t xml:space="preserve">’ String </w:t>
+      </w:r>
+    </w:p>
+    <w:p>
+      <w:pPr>
+        <w:pStyle w:val="ListParagraph"/>
+        <w:numPr>
+          <w:ilvl w:val="1"/>
+          <w:numId w:val="27"/>
+        </w:numPr>
+      </w:pPr>
+      <w:proofErr w:type="gramStart"/>
+      <w:r>
+        <w:t>Returns</w:t>
+      </w:r>
+      <w:proofErr w:type="gramEnd"/>
+      <w:r>
+        <w:t xml:space="preserve"> a set of provider records </w:t>
+      </w:r>
+    </w:p>
+    <w:p>
+      <w:pPr>
+        <w:pStyle w:val="ListParagraph"/>
+        <w:numPr>
+          <w:ilvl w:val="1"/>
+          <w:numId w:val="27"/>
+        </w:numPr>
+      </w:pPr>
+      <w:r>
+        <w:t>Behavior</w:t>
+      </w:r>
+    </w:p>
+    <w:p>
+      <w:pPr>
+        <w:pStyle w:val="ListParagraph"/>
+        <w:numPr>
+          <w:ilvl w:val="2"/>
+          <w:numId w:val="27"/>
+        </w:numPr>
+      </w:pPr>
+      <w:proofErr w:type="gramStart"/>
+      <w:r>
+        <w:t>Get’s</w:t>
+      </w:r>
+      <w:proofErr w:type="gramEnd"/>
+      <w:r>
+        <w:t xml:space="preserve"> the value of </w:t>
+      </w:r>
+      <w:r>
+        <w:t>‘</w:t>
+      </w:r>
+      <w:proofErr w:type="spellStart"/>
+      <w:r>
+        <w:t>NextZipCode</w:t>
+      </w:r>
+      <w:proofErr w:type="spellEnd"/>
+      <w:r>
+        <w:t>’</w:t>
+      </w:r>
+    </w:p>
+    <w:p>
+      <w:pPr>
+        <w:pStyle w:val="ListParagraph"/>
+        <w:numPr>
+          <w:ilvl w:val="3"/>
+          <w:numId w:val="27"/>
+        </w:numPr>
+      </w:pPr>
+      <w:proofErr w:type="gramStart"/>
+      <w:r>
+        <w:t>Replaces</w:t>
+      </w:r>
+      <w:proofErr w:type="gramEnd"/>
+      <w:r>
+        <w:t xml:space="preserve"> it with the next zip code after the one it just got. </w:t>
+      </w:r>
+    </w:p>
+    <w:p>
+      <w:pPr>
+        <w:pStyle w:val="ListParagraph"/>
+        <w:numPr>
+          <w:ilvl w:val="3"/>
+          <w:numId w:val="27"/>
+        </w:numPr>
+      </w:pPr>
+      <w:r>
+        <w:t>Uses the ‘</w:t>
+      </w:r>
+      <w:proofErr w:type="spellStart"/>
+      <w:r>
+        <w:t>NextZipCode</w:t>
+      </w:r>
+      <w:proofErr w:type="spellEnd"/>
+      <w:r>
+        <w:t xml:space="preserve"> </w:t>
+      </w:r>
+      <w:r>
+        <w:t>value</w:t>
+      </w:r>
+      <w:r>
+        <w:t xml:space="preserve"> collected to get all the provider records associated with that zip code. </w:t>
+      </w:r>
+      <w:r>
+        <w:t xml:space="preserve">Use the business rules associated with the Provider object to find the correct records. </w:t>
+      </w:r>
+    </w:p>
+    <w:p>
+      <w:pPr>
+        <w:pStyle w:val="ListParagraph"/>
+        <w:numPr>
+          <w:ilvl w:val="3"/>
+          <w:numId w:val="27"/>
+        </w:numPr>
+      </w:pPr>
+      <w:r>
+        <w:t>Returns the container of Provider records to the user. These are ‘copies of the records, and not pointers to the records in the data base’</w:t>
+      </w:r>
+    </w:p>
+    <w:p>
+      <w:pPr>
+        <w:pStyle w:val="ListParagraph"/>
+        <w:numPr>
+          <w:ilvl w:val="3"/>
+          <w:numId w:val="27"/>
+        </w:numPr>
+      </w:pPr>
+      <w:r>
+        <w:t xml:space="preserve">This shall only be used as a stack variable and must therefore be thread safe. </w:t>
+      </w:r>
+    </w:p>
+    <w:p>
+      <w:pPr>
+        <w:pStyle w:val="ListParagraph"/>
+        <w:numPr>
+          <w:ilvl w:val="1"/>
+          <w:numId w:val="27"/>
+        </w:numPr>
+      </w:pPr>
+      <w:r>
+        <w:t>Function</w:t>
+      </w:r>
+    </w:p>
+    <w:p>
+      <w:pPr>
+        <w:pStyle w:val="ListParagraph"/>
+        <w:numPr>
+          <w:ilvl w:val="2"/>
+          <w:numId w:val="27"/>
+        </w:numPr>
+      </w:pPr>
+      <w:r>
+        <w:t xml:space="preserve">Function Name: </w:t>
+      </w:r>
+      <w:proofErr w:type="spellStart"/>
+      <w:r>
+        <w:t>Get</w:t>
+      </w:r>
+      <w:r>
+        <w:t>CountyZipEnriched_GDP</w:t>
+      </w:r>
+      <w:r>
+        <w:t>Records</w:t>
+      </w:r>
+      <w:proofErr w:type="spellEnd"/>
+    </w:p>
+    <w:p>
+      <w:pPr>
+        <w:pStyle w:val="ListParagraph"/>
+        <w:numPr>
+          <w:ilvl w:val="2"/>
+          <w:numId w:val="27"/>
+        </w:numPr>
+      </w:pPr>
+      <w:r>
+        <w:t xml:space="preserve">Returns a container of </w:t>
+      </w:r>
+      <w:proofErr w:type="spellStart"/>
+      <w:r>
+        <w:t>CountyZipEnriched_GDP</w:t>
+      </w:r>
+      <w:r>
+        <w:t>Records</w:t>
+      </w:r>
+      <w:proofErr w:type="spellEnd"/>
+    </w:p>
+    <w:p>
+      <w:pPr>
+        <w:pStyle w:val="ListParagraph"/>
+        <w:numPr>
+          <w:ilvl w:val="2"/>
+          <w:numId w:val="27"/>
+        </w:numPr>
+      </w:pPr>
+      <w:r>
+        <w:t xml:space="preserve">Argument: </w:t>
+      </w:r>
+      <w:proofErr w:type="spellStart"/>
+      <w:r>
+        <w:t>argZipCode</w:t>
+      </w:r>
+      <w:proofErr w:type="spellEnd"/>
+      <w:r>
+        <w:t xml:space="preserve">, the zip code to use for a match. </w:t>
+      </w:r>
+    </w:p>
+    <w:p>
+      <w:pPr>
+        <w:pStyle w:val="ListParagraph"/>
+        <w:numPr>
+          <w:ilvl w:val="2"/>
+          <w:numId w:val="27"/>
+        </w:numPr>
+      </w:pPr>
+      <w:r>
+        <w:t>Behavior</w:t>
+      </w:r>
+    </w:p>
+    <w:p>
+      <w:pPr>
+        <w:pStyle w:val="ListParagraph"/>
+        <w:numPr>
+          <w:ilvl w:val="3"/>
+          <w:numId w:val="27"/>
+        </w:numPr>
+      </w:pPr>
+      <w:proofErr w:type="gramStart"/>
+      <w:r>
+        <w:t>Callers of this</w:t>
+      </w:r>
+      <w:proofErr w:type="gramEnd"/>
+      <w:r>
+        <w:t xml:space="preserve"> should call this before the function </w:t>
+      </w:r>
+      <w:proofErr w:type="spellStart"/>
+      <w:r>
+        <w:t>getProvidersByZip</w:t>
+      </w:r>
+      <w:proofErr w:type="spellEnd"/>
+      <w:r>
+        <w:t xml:space="preserve"> is called so that they use the same zip as that function returns. That function advances the pointer to the right zip. </w:t>
+      </w:r>
+    </w:p>
+    <w:p>
+      <w:pPr>
+        <w:pStyle w:val="ListParagraph"/>
+        <w:numPr>
+          <w:ilvl w:val="3"/>
+          <w:numId w:val="27"/>
+        </w:numPr>
+      </w:pPr>
+      <w:r>
+        <w:t xml:space="preserve">Gets </w:t>
+      </w:r>
+      <w:proofErr w:type="gramStart"/>
+      <w:r>
+        <w:t>all of</w:t>
+      </w:r>
+      <w:proofErr w:type="gramEnd"/>
+      <w:r>
+        <w:t xml:space="preserve"> the </w:t>
+      </w:r>
+      <w:proofErr w:type="spellStart"/>
+      <w:r>
+        <w:t>Get</w:t>
+      </w:r>
+      <w:r>
+        <w:t>CountyZipEnriched_GDP</w:t>
+      </w:r>
+      <w:proofErr w:type="spellEnd"/>
+      <w:r>
+        <w:t xml:space="preserve"> </w:t>
+      </w:r>
+      <w:r>
+        <w:t xml:space="preserve">records with the zip code used in the argument. </w:t>
+      </w:r>
+    </w:p>
+    <w:p>
+      <w:pPr>
+        <w:pStyle w:val="ListParagraph"/>
+        <w:numPr>
+          <w:ilvl w:val="1"/>
+          <w:numId w:val="27"/>
+        </w:numPr>
+      </w:pPr>
+      <w:r>
+        <w:t>Function:</w:t>
+      </w:r>
+    </w:p>
+    <w:p>
+      <w:pPr>
+        <w:pStyle w:val="ListParagraph"/>
+        <w:numPr>
+          <w:ilvl w:val="2"/>
+          <w:numId w:val="27"/>
+        </w:numPr>
+      </w:pPr>
+      <w:r>
+        <w:t xml:space="preserve">Function Name </w:t>
+      </w:r>
+      <w:proofErr w:type="spellStart"/>
+      <w:r>
+        <w:t>Process</w:t>
+      </w:r>
+      <w:r>
+        <w:t>ProviderRecord</w:t>
+      </w:r>
+      <w:proofErr w:type="spellEnd"/>
+    </w:p>
+    <w:p>
+      <w:pPr>
+        <w:pStyle w:val="ListParagraph"/>
+        <w:numPr>
+          <w:ilvl w:val="2"/>
+          <w:numId w:val="27"/>
+        </w:numPr>
+      </w:pPr>
+      <w:r>
+        <w:t xml:space="preserve">Returns true or throws an </w:t>
+      </w:r>
+      <w:proofErr w:type="spellStart"/>
+      <w:r>
+        <w:t>exccption</w:t>
+      </w:r>
+      <w:proofErr w:type="spellEnd"/>
+      <w:r>
+        <w:t xml:space="preserve">. </w:t>
+      </w:r>
+    </w:p>
+    <w:p>
+      <w:pPr>
+        <w:pStyle w:val="ListParagraph"/>
+        <w:numPr>
+          <w:ilvl w:val="2"/>
+          <w:numId w:val="27"/>
+        </w:numPr>
+      </w:pPr>
+      <w:r>
+        <w:t>Function arguments:</w:t>
+      </w:r>
+    </w:p>
+    <w:p>
+      <w:pPr>
+        <w:pStyle w:val="ListParagraph"/>
+        <w:numPr>
+          <w:ilvl w:val="3"/>
+          <w:numId w:val="27"/>
+        </w:numPr>
+      </w:pPr>
+      <w:proofErr w:type="spellStart"/>
+      <w:r>
+        <w:t>ArgProviderRecord</w:t>
+      </w:r>
+      <w:proofErr w:type="spellEnd"/>
+      <w:r>
+        <w:t>. This is the JSON String that represents a provider record.</w:t>
+      </w:r>
+      <w:r>
+        <w:t xml:space="preserve"> </w:t>
+      </w:r>
+    </w:p>
+    <w:p>
+      <w:pPr>
+        <w:pStyle w:val="ListParagraph"/>
+        <w:numPr>
+          <w:ilvl w:val="1"/>
+          <w:numId w:val="27"/>
+        </w:numPr>
+      </w:pPr>
+      <w:proofErr w:type="spellStart"/>
+      <w:r>
+        <w:lastRenderedPageBreak/>
+        <w:t>Arg</w:t>
+      </w:r>
+      <w:r>
+        <w:t>CountyZipEnriched_GDP</w:t>
+      </w:r>
+      <w:r>
+        <w:t>Records</w:t>
+      </w:r>
+      <w:proofErr w:type="spellEnd"/>
+      <w:r>
+        <w:t xml:space="preserve">. This is a pointer to all </w:t>
+      </w:r>
+      <w:proofErr w:type="spellStart"/>
+      <w:r>
+        <w:t>CountyZipEnriched_GDP</w:t>
+      </w:r>
+      <w:r>
+        <w:t>record</w:t>
+      </w:r>
+      <w:r>
+        <w:t>s</w:t>
+      </w:r>
+      <w:proofErr w:type="spellEnd"/>
+      <w:r>
+        <w:t xml:space="preserve"> that match the zip of the provider. </w:t>
+      </w:r>
+    </w:p>
+    <w:p>
+      <w:pPr>
+        <w:pStyle w:val="ListParagraph"/>
+        <w:numPr>
+          <w:ilvl w:val="1"/>
+          <w:numId w:val="27"/>
+        </w:numPr>
+      </w:pPr>
+      <w:r>
+        <w:t>Function Behavior</w:t>
+      </w:r>
+    </w:p>
+    <w:p>
+      <w:pPr>
+        <w:pStyle w:val="ListParagraph"/>
+        <w:numPr>
+          <w:ilvl w:val="2"/>
+          <w:numId w:val="27"/>
+        </w:numPr>
+      </w:pPr>
+      <w:r>
+        <w:t xml:space="preserve">For the </w:t>
+      </w:r>
+      <w:proofErr w:type="spellStart"/>
+      <w:r>
+        <w:t>ProviderRecord</w:t>
+      </w:r>
+      <w:proofErr w:type="spellEnd"/>
+      <w:r>
+        <w:t xml:space="preserve"> create an </w:t>
+      </w:r>
+      <w:proofErr w:type="spellStart"/>
+      <w:r>
+        <w:t>EnrichedProvide</w:t>
+      </w:r>
+      <w:r>
+        <w:t>r</w:t>
+      </w:r>
+      <w:proofErr w:type="spellEnd"/>
+      <w:r>
+        <w:t xml:space="preserve"> record. If the record exists throw an </w:t>
+      </w:r>
+      <w:proofErr w:type="spellStart"/>
+      <w:r>
+        <w:t>exeption</w:t>
+      </w:r>
+      <w:proofErr w:type="spellEnd"/>
+      <w:r>
+        <w:t xml:space="preserve">.  </w:t>
+      </w:r>
+    </w:p>
+    <w:p>
+      <w:pPr>
+        <w:pStyle w:val="ListParagraph"/>
+        <w:numPr>
+          <w:ilvl w:val="2"/>
+          <w:numId w:val="27"/>
+        </w:numPr>
+      </w:pPr>
+      <w:r>
+        <w:t>The record will be e</w:t>
+      </w:r>
+      <w:r>
+        <w:t>nriched</w:t>
+      </w:r>
+      <w:r>
+        <w:t xml:space="preserve"> by adding the following information</w:t>
+      </w:r>
+      <w:r>
+        <w:t xml:space="preserve"> embedded in a new first level provider Attribute named </w:t>
+      </w:r>
+      <w:proofErr w:type="spellStart"/>
+      <w:r>
+        <w:t>CountyInfo</w:t>
+      </w:r>
+      <w:proofErr w:type="spellEnd"/>
+      <w:r>
+        <w:t xml:space="preserve"> with the fields:</w:t>
+      </w:r>
+    </w:p>
+    <w:p>
+      <w:pPr>
+        <w:pStyle w:val="ListParagraph"/>
+        <w:numPr>
+          <w:ilvl w:val="3"/>
+          <w:numId w:val="27"/>
+        </w:numPr>
+        <w:rPr>
+          <w:rFonts w:ascii="Courier New" w:hAnsi="Courier New" w:cs="Courier New"/>
+          <w:sz w:val="16"/>
+          <w:szCs w:val="16"/>
+        </w:rPr>
+      </w:pPr>
+      <w:r>
+        <w:rPr>
+          <w:rFonts w:ascii="Courier New" w:hAnsi="Courier New" w:cs="Courier New"/>
+          <w:sz w:val="16"/>
+          <w:szCs w:val="16"/>
+        </w:rPr>
+        <w:t>“</w:t>
+      </w:r>
+      <w:proofErr w:type="spellStart"/>
+      <w:r>
+        <w:rPr>
+          <w:rFonts w:ascii="Courier New" w:hAnsi="Courier New" w:cs="Courier New"/>
+          <w:sz w:val="16"/>
+          <w:szCs w:val="16"/>
+        </w:rPr>
+        <w:t>countyFips</w:t>
+      </w:r>
+      <w:proofErr w:type="spellEnd"/>
+      <w:r>
+        <w:rPr>
+          <w:rFonts w:ascii="Courier New" w:hAnsi="Courier New" w:cs="Courier New"/>
+          <w:sz w:val="16"/>
+          <w:szCs w:val="16"/>
+        </w:rPr>
+        <w:t>"</w:t>
+      </w:r>
+    </w:p>
+    <w:p>
+      <w:pPr>
+        <w:pStyle w:val="ListParagraph"/>
+        <w:numPr>
+          <w:ilvl w:val="3"/>
+          <w:numId w:val="27"/>
+        </w:numPr>
+        <w:rPr>
+          <w:rFonts w:ascii="Courier New" w:hAnsi="Courier New" w:cs="Courier New"/>
+          <w:sz w:val="16"/>
+          <w:szCs w:val="16"/>
+        </w:rPr>
+      </w:pPr>
+      <w:r>
+        <w:rPr>
+          <w:rFonts w:ascii="Courier New" w:hAnsi="Courier New" w:cs="Courier New"/>
+          <w:sz w:val="16"/>
+          <w:szCs w:val="16"/>
+        </w:rPr>
+        <w:t xml:space="preserve"> "</w:t>
+      </w:r>
+      <w:proofErr w:type="spellStart"/>
+      <w:r>
+        <w:rPr>
+          <w:rFonts w:ascii="Courier New" w:hAnsi="Courier New" w:cs="Courier New"/>
+          <w:sz w:val="16"/>
+          <w:szCs w:val="16"/>
+        </w:rPr>
+        <w:t>countyName</w:t>
+      </w:r>
+      <w:proofErr w:type="spellEnd"/>
+      <w:r>
+        <w:rPr>
+          <w:rFonts w:ascii="Courier New" w:hAnsi="Courier New" w:cs="Courier New"/>
+          <w:sz w:val="16"/>
+          <w:szCs w:val="16"/>
+        </w:rPr>
+        <w:t xml:space="preserve">" </w:t>
+      </w:r>
+    </w:p>
+    <w:p>
+      <w:pPr>
+        <w:pStyle w:val="ListParagraph"/>
+        <w:numPr>
+          <w:ilvl w:val="3"/>
+          <w:numId w:val="27"/>
+        </w:numPr>
+        <w:rPr>
+          <w:rFonts w:ascii="Courier New" w:hAnsi="Courier New" w:cs="Courier New"/>
+          <w:sz w:val="16"/>
+          <w:szCs w:val="16"/>
+        </w:rPr>
+      </w:pPr>
+      <w:r>
+        <w:rPr>
+          <w:rFonts w:ascii="Courier New" w:hAnsi="Courier New" w:cs="Courier New"/>
+          <w:sz w:val="16"/>
+          <w:szCs w:val="16"/>
+        </w:rPr>
+        <w:t xml:space="preserve"> "</w:t>
+      </w:r>
+      <w:proofErr w:type="spellStart"/>
+      <w:r>
+        <w:rPr>
+          <w:rFonts w:ascii="Courier New" w:hAnsi="Courier New" w:cs="Courier New"/>
+          <w:sz w:val="16"/>
+          <w:szCs w:val="16"/>
+        </w:rPr>
+        <w:t>mainCity</w:t>
+      </w:r>
+      <w:proofErr w:type="spellEnd"/>
+      <w:r>
+        <w:rPr>
+          <w:rFonts w:ascii="Courier New" w:hAnsi="Courier New" w:cs="Courier New"/>
+          <w:sz w:val="16"/>
+          <w:szCs w:val="16"/>
+        </w:rPr>
+        <w:t>"</w:t>
+      </w:r>
+    </w:p>
+    <w:p>
+      <w:pPr>
+        <w:pStyle w:val="ListParagraph"/>
+        <w:numPr>
+          <w:ilvl w:val="3"/>
+          <w:numId w:val="27"/>
+        </w:numPr>
+        <w:rPr>
+          <w:rFonts w:ascii="Courier New" w:hAnsi="Courier New" w:cs="Courier New"/>
+          <w:sz w:val="12"/>
+          <w:szCs w:val="12"/>
+        </w:rPr>
+      </w:pPr>
+      <w:r>
+        <w:rPr>
+          <w:rFonts w:ascii="Courier New" w:hAnsi="Courier New" w:cs="Courier New"/>
+          <w:sz w:val="16"/>
+          <w:szCs w:val="16"/>
+        </w:rPr>
+        <w:t xml:space="preserve"> "</w:t>
+      </w:r>
+      <w:proofErr w:type="spellStart"/>
+      <w:r>
+        <w:rPr>
+          <w:rFonts w:ascii="Courier New" w:hAnsi="Courier New" w:cs="Courier New"/>
+          <w:sz w:val="16"/>
+          <w:szCs w:val="16"/>
+        </w:rPr>
+        <w:t>percentOfZipInCounty</w:t>
+      </w:r>
+      <w:proofErr w:type="spellEnd"/>
+      <w:r>
+        <w:rPr>
+          <w:rFonts w:ascii="Courier New" w:hAnsi="Courier New" w:cs="Courier New"/>
+          <w:sz w:val="12"/>
+          <w:szCs w:val="12"/>
+        </w:rPr>
+        <w:t>"</w:t>
+      </w:r>
+    </w:p>
+    <w:p>
+      <w:pPr>
+        <w:pStyle w:val="ListParagraph"/>
+        <w:numPr>
+          <w:ilvl w:val="3"/>
+          <w:numId w:val="27"/>
+        </w:numPr>
+        <w:rPr>
+          <w:rFonts w:ascii="Courier New" w:hAnsi="Courier New" w:cs="Courier New"/>
+          <w:sz w:val="16"/>
+          <w:szCs w:val="16"/>
+        </w:rPr>
+      </w:pPr>
+      <w:r>
+        <w:rPr>
+          <w:rFonts w:ascii="Courier New" w:hAnsi="Courier New" w:cs="Courier New"/>
+          <w:sz w:val="16"/>
+          <w:szCs w:val="16"/>
+        </w:rPr>
+        <w:t xml:space="preserve"> "realGDP2023"</w:t>
+      </w:r>
+    </w:p>
+    <w:p>
+      <w:pPr>
+        <w:pStyle w:val="ListParagraph"/>
+        <w:numPr>
+          <w:ilvl w:val="3"/>
+          <w:numId w:val="27"/>
+        </w:numPr>
+        <w:rPr>
+          <w:rFonts w:ascii="Courier New" w:hAnsi="Courier New" w:cs="Courier New"/>
+          <w:sz w:val="16"/>
+          <w:szCs w:val="16"/>
+        </w:rPr>
+      </w:pPr>
+      <w:r>
+        <w:rPr>
+          <w:rFonts w:ascii="Courier New" w:hAnsi="Courier New" w:cs="Courier New"/>
+          <w:sz w:val="16"/>
+          <w:szCs w:val="16"/>
+        </w:rPr>
+        <w:t xml:space="preserve"> "gdpRankInState2023"</w:t>
+      </w:r>
+    </w:p>
+    <w:p>
+      <w:pPr>
+        <w:pStyle w:val="ListParagraph"/>
+        <w:numPr>
+          <w:ilvl w:val="3"/>
+          <w:numId w:val="27"/>
+        </w:numPr>
+        <w:rPr>
+          <w:rFonts w:ascii="Courier New" w:hAnsi="Courier New" w:cs="Courier New"/>
+          <w:sz w:val="16"/>
+          <w:szCs w:val="16"/>
+        </w:rPr>
+      </w:pPr>
+      <w:r>
+        <w:rPr>
+          <w:rFonts w:ascii="Courier New" w:hAnsi="Courier New" w:cs="Courier New"/>
+          <w:sz w:val="16"/>
+          <w:szCs w:val="16"/>
+        </w:rPr>
+        <w:t xml:space="preserve"> "percentChange2023"</w:t>
+      </w:r>
+    </w:p>
+    <w:p>
+      <w:pPr>
+        <w:pStyle w:val="ListParagraph"/>
+        <w:numPr>
+          <w:ilvl w:val="3"/>
+          <w:numId w:val="27"/>
+        </w:numPr>
+        <w:rPr>
+          <w:rFonts w:ascii="Courier New" w:hAnsi="Courier New" w:cs="Courier New"/>
+          <w:sz w:val="16"/>
+          <w:szCs w:val="16"/>
+        </w:rPr>
+      </w:pPr>
+      <w:r>
+        <w:rPr>
+          <w:rFonts w:ascii="Courier New" w:hAnsi="Courier New" w:cs="Courier New"/>
+          <w:sz w:val="16"/>
+          <w:szCs w:val="16"/>
+        </w:rPr>
+        <w:t xml:space="preserve"> "percentChangeRankInState2023"</w:t>
+      </w:r>
+    </w:p>
+    <w:p>
+      <w:pPr>
+        <w:pStyle w:val="ListParagraph"/>
+        <w:numPr>
+          <w:ilvl w:val="2"/>
+          <w:numId w:val="27"/>
+        </w:numPr>
+      </w:pPr>
+      <w:r>
+        <w:t xml:space="preserve">These fields in the enriched record shall be faithful copies of the values in the </w:t>
+      </w:r>
+      <w:proofErr w:type="spellStart"/>
+      <w:r>
+        <w:t>GetCountyZipEnriched_GDP</w:t>
+      </w:r>
+      <w:proofErr w:type="spellEnd"/>
+      <w:r>
+        <w:t xml:space="preserve"> record that has over 99% </w:t>
+      </w:r>
+      <w:proofErr w:type="spellStart"/>
+      <w:r>
+        <w:rPr>
+          <w:rFonts w:ascii="Courier New" w:hAnsi="Courier New" w:cs="Courier New"/>
+          <w:sz w:val="16"/>
+          <w:szCs w:val="16"/>
+        </w:rPr>
+        <w:t>percentOfZipInCounty</w:t>
+      </w:r>
+      <w:proofErr w:type="spellEnd"/>
+      <w:r>
+        <w:rPr>
+          <w:rFonts w:ascii="Courier New" w:hAnsi="Courier New" w:cs="Courier New"/>
+          <w:sz w:val="16"/>
+          <w:szCs w:val="16"/>
+        </w:rPr>
+        <w:t xml:space="preserve">. </w:t>
+      </w:r>
+    </w:p>
+    <w:p>
+      <w:pPr>
+        <w:pStyle w:val="ListParagraph"/>
+        <w:numPr>
+          <w:ilvl w:val="2"/>
+          <w:numId w:val="27"/>
+        </w:numPr>
+      </w:pPr>
+      <w:r>
+        <w:t xml:space="preserve">If no </w:t>
+      </w:r>
+      <w:proofErr w:type="spellStart"/>
+      <w:r>
+        <w:t>GetCountyZipEnriched_GDP</w:t>
+      </w:r>
+      <w:r>
+        <w:t>.</w:t>
+      </w:r>
+      <w:r>
+        <w:rPr>
+          <w:rFonts w:ascii="Courier New" w:hAnsi="Courier New" w:cs="Courier New"/>
+          <w:sz w:val="16"/>
+          <w:szCs w:val="16"/>
+        </w:rPr>
+        <w:t>percentOfZipInCounty</w:t>
+      </w:r>
+      <w:proofErr w:type="spellEnd"/>
+      <w:r>
+        <w:rPr>
+          <w:rFonts w:ascii="Courier New" w:hAnsi="Courier New" w:cs="Courier New"/>
+          <w:sz w:val="16"/>
+          <w:szCs w:val="16"/>
+        </w:rPr>
+        <w:t xml:space="preserve"> is greater than 90% the object </w:t>
+      </w:r>
+      <w:proofErr w:type="spellStart"/>
+      <w:r>
+        <w:rPr>
+          <w:rFonts w:ascii="Courier New" w:hAnsi="Courier New" w:cs="Courier New"/>
+          <w:sz w:val="16"/>
+          <w:szCs w:val="16"/>
+        </w:rPr>
+        <w:t>CountyInfo</w:t>
+      </w:r>
+      <w:proofErr w:type="spellEnd"/>
+      <w:r>
+        <w:rPr>
+          <w:rFonts w:ascii="Courier New" w:hAnsi="Courier New" w:cs="Courier New"/>
+          <w:sz w:val="16"/>
+          <w:szCs w:val="16"/>
+        </w:rPr>
+        <w:t xml:space="preserve"> should be set to null. </w:t>
+      </w:r>
+    </w:p>
+    <w:p>
+      <w:pPr>
+        <w:pStyle w:val="ListParagraph"/>
+        <w:numPr>
+          <w:ilvl w:val="1"/>
+          <w:numId w:val="27"/>
+        </w:numPr>
+      </w:pPr>
+      <w:r>
+        <w:t>Function</w:t>
+      </w:r>
+    </w:p>
+    <w:p>
+      <w:pPr>
+        <w:pStyle w:val="ListParagraph"/>
+        <w:numPr>
+          <w:ilvl w:val="2"/>
+          <w:numId w:val="27"/>
+        </w:numPr>
+      </w:pPr>
+      <w:r>
+        <w:t xml:space="preserve">Function Name: </w:t>
+      </w:r>
+      <w:proofErr w:type="spellStart"/>
+      <w:r>
+        <w:t>ProcessAllRecords</w:t>
+      </w:r>
+      <w:proofErr w:type="spellEnd"/>
+    </w:p>
+    <w:p>
+      <w:pPr>
+        <w:pStyle w:val="ListParagraph"/>
+        <w:numPr>
+          <w:ilvl w:val="2"/>
+          <w:numId w:val="27"/>
+        </w:numPr>
+      </w:pPr>
+      <w:r>
+        <w:t>Function Arguments none.</w:t>
+      </w:r>
+    </w:p>
+    <w:p>
+      <w:pPr>
+        <w:pStyle w:val="ListParagraph"/>
+        <w:numPr>
+          <w:ilvl w:val="2"/>
+          <w:numId w:val="27"/>
+        </w:numPr>
+      </w:pPr>
+      <w:r>
+        <w:t xml:space="preserve">Function returns TRUE or throws exception. </w:t>
+      </w:r>
+    </w:p>
+    <w:p>
+      <w:pPr>
+        <w:pStyle w:val="ListParagraph"/>
+        <w:numPr>
+          <w:ilvl w:val="3"/>
+          <w:numId w:val="27"/>
+        </w:numPr>
+      </w:pPr>
+      <w:r>
+        <w:t xml:space="preserve">Exception should say how many records were processed and give a reason for the failure. Processed means were inserted into the target collection. </w:t>
+      </w:r>
+    </w:p>
+    <w:p>
+      <w:pPr>
+        <w:pStyle w:val="ListParagraph"/>
+        <w:numPr>
+          <w:ilvl w:val="2"/>
+          <w:numId w:val="27"/>
+        </w:numPr>
+      </w:pPr>
+      <w:r>
+        <w:t>Function behavior.</w:t>
+      </w:r>
+    </w:p>
+    <w:p>
+      <w:pPr>
+        <w:pStyle w:val="ListParagraph"/>
+        <w:numPr>
+          <w:ilvl w:val="3"/>
+          <w:numId w:val="27"/>
+        </w:numPr>
+      </w:pPr>
+      <w:r>
+        <w:t xml:space="preserve">This function should be optimized to be as efficient as possible. Batch transmissions to Mongo, Parallelism within the function so that as much work can be allocated to the database as possible. </w:t>
+      </w:r>
+    </w:p>
+    <w:p>
+      <w:pPr>
+        <w:pStyle w:val="ListParagraph"/>
+        <w:numPr>
+          <w:ilvl w:val="3"/>
+          <w:numId w:val="27"/>
+        </w:numPr>
+      </w:pPr>
+      <w:r>
+        <w:t xml:space="preserve">Sensitive to the limits of Mongo and therefore algorithmic doing retries as per best practices. </w:t>
+      </w:r>
+    </w:p>
+    <w:p>
+      <w:pPr>
+        <w:pStyle w:val="ListParagraph"/>
+        <w:numPr>
+          <w:ilvl w:val="2"/>
+          <w:numId w:val="27"/>
+        </w:numPr>
+      </w:pPr>
+      <w:r>
+        <w:t xml:space="preserve">Recommended, collect as many zip code provider records as can fit into a batch call to Mongo, and do that in parallel. But ensure that when there is a failure due to resource constraints from the server there are at least 4 retries before the call is abandoned. Stagger the retries as per best practices. </w:t>
+      </w:r>
     </w:p>
     <w:sectPr>
       <w:pgSz w:w="12240" w:h="15840"/>
@@ -7141,6 +10782,119 @@
 <file path=word/numbering.xml><?xml version="1.0" encoding="utf-8"?>
 <w:numbering xmlns:wpc="http://schemas.microsoft.com/office/word/2010/wordprocessingCanvas" xmlns:cx="http://schemas.microsoft.com/office/drawing/2014/chartex" xmlns:cx1="http://schemas.microsoft.com/office/drawing/2015/9/8/chartex" xmlns:cx2="http://schemas.microsoft.com/office/drawing/2015/10/21/chartex" xmlns:cx3="http://schemas.microsoft.com/office/drawing/2016/5/9/chartex" xmlns:cx4="http://schemas.microsoft.com/office/drawing/2016/5/10/chartex" xmlns:cx5="http://schemas.microsoft.com/office/drawing/2016/5/11/chartex" xmlns:cx6="http://schemas.microsoft.com/office/drawing/2016/5/12/chartex" xmlns:cx7="http://schemas.microsoft.com/office/drawing/2016/5/13/chartex" xmlns:cx8="http://schemas.microsoft.com/office/drawing/2016/5/14/chartex" xmlns:mc="http://schemas.openxmlformats.org/markup-compatibility/2006" xmlns:aink="http://schemas.microsoft.com/office/drawing/2016/ink" xmlns:am3d="http://schemas.microsoft.com/office/drawing/2017/model3d" xmlns:o="urn:schemas-microsoft-com:office:office" xmlns:oel="http://schemas.microsoft.com/office/2019/extlst" xmlns:r="http://schemas.openxmlformats.org/officeDocument/2006/relationships" xmlns:m="http://schemas.openxmlformats.org/officeDocument/2006/math" xmlns:v="urn:schemas-microsoft-com:vml" xmlns:wp14="http://schemas.microsoft.com/office/word/2010/wordprocessingDrawing" xmlns:wp="http://schemas.openxmlformats.org/drawingml/2006/wordprocessingDrawing" xmlns:w10="urn:schemas-microsoft-com:office:word" xmlns:w="http://schemas.openxmlformats.org/wordprocessingml/2006/main" xmlns:w14="http://schemas.microsoft.com/office/word/2010/wordml" xmlns:w15="http://schemas.microsoft.com/office/word/2012/wordml" xmlns:w16cex="http://schemas.microsoft.com/office/word/2018/wordml/cex" xmlns:w16cid="http://schemas.microsoft.com/office/word/2016/wordml/cid" xmlns:w16="http://schemas.microsoft.com/office/word/2018/wordml" xmlns:w16du="http://schemas.microsoft.com/office/word/2023/wordml/word16du" xmlns:w16sdtdh="http://schemas.microsoft.com/office/word/2020/wordml/sdtdatahash" xmlns:w16sdtfl="http://schemas.microsoft.com/office/word/2024/wordml/sdtformatlock" xmlns:w16se="http://schemas.microsoft.com/office/word/2015/wordml/symex" xmlns:wpg="http://schemas.microsoft.com/office/word/2010/wordprocessingGroup" xmlns:wpi="http://schemas.microsoft.com/office/word/2010/wordprocessingInk" xmlns:wne="http://schemas.microsoft.com/office/word/2006/wordml" xmlns:wps="http://schemas.microsoft.com/office/word/2010/wordprocessingShape" mc:Ignorable="w14 w15 w16se w16cid w16 w16cex w16sdtdh w16sdtfl w16du wp14">
   <w:abstractNum w:abstractNumId="0" w15:restartNumberingAfterBreak="0">
+    <w:nsid w:val="0A813487"/>
+    <w:multiLevelType w:val="hybridMultilevel"/>
+    <w:tmpl w:val="A042B30C"/>
+    <w:lvl w:ilvl="0" w:tplc="04090001">
+      <w:start w:val="1"/>
+      <w:numFmt w:val="bullet"/>
+      <w:lvlText w:val=""/>
+      <w:lvlJc w:val="left"/>
+      <w:pPr>
+        <w:ind w:left="720" w:hanging="360"/>
+      </w:pPr>
+      <w:rPr>
+        <w:rFonts w:ascii="Symbol" w:hAnsi="Symbol" w:hint="default"/>
+      </w:rPr>
+    </w:lvl>
+    <w:lvl w:ilvl="1" w:tplc="04090003" w:tentative="1">
+      <w:start w:val="1"/>
+      <w:numFmt w:val="bullet"/>
+      <w:lvlText w:val="o"/>
+      <w:lvlJc w:val="left"/>
+      <w:pPr>
+        <w:ind w:left="1440" w:hanging="360"/>
+      </w:pPr>
+      <w:rPr>
+        <w:rFonts w:ascii="Courier New" w:hAnsi="Courier New" w:cs="Courier New" w:hint="default"/>
+      </w:rPr>
+    </w:lvl>
+    <w:lvl w:ilvl="2" w:tplc="04090005" w:tentative="1">
+      <w:start w:val="1"/>
+      <w:numFmt w:val="bullet"/>
+      <w:lvlText w:val=""/>
+      <w:lvlJc w:val="left"/>
+      <w:pPr>
+        <w:ind w:left="2160" w:hanging="360"/>
+      </w:pPr>
+      <w:rPr>
+        <w:rFonts w:ascii="Wingdings" w:hAnsi="Wingdings" w:hint="default"/>
+      </w:rPr>
+    </w:lvl>
+    <w:lvl w:ilvl="3" w:tplc="04090001" w:tentative="1">
+      <w:start w:val="1"/>
+      <w:numFmt w:val="bullet"/>
+      <w:lvlText w:val=""/>
+      <w:lvlJc w:val="left"/>
+      <w:pPr>
+        <w:ind w:left="2880" w:hanging="360"/>
+      </w:pPr>
+      <w:rPr>
+        <w:rFonts w:ascii="Symbol" w:hAnsi="Symbol" w:hint="default"/>
+      </w:rPr>
+    </w:lvl>
+    <w:lvl w:ilvl="4" w:tplc="04090003" w:tentative="1">
+      <w:start w:val="1"/>
+      <w:numFmt w:val="bullet"/>
+      <w:lvlText w:val="o"/>
+      <w:lvlJc w:val="left"/>
+      <w:pPr>
+        <w:ind w:left="3600" w:hanging="360"/>
+      </w:pPr>
+      <w:rPr>
+        <w:rFonts w:ascii="Courier New" w:hAnsi="Courier New" w:cs="Courier New" w:hint="default"/>
+      </w:rPr>
+    </w:lvl>
+    <w:lvl w:ilvl="5" w:tplc="04090005" w:tentative="1">
+      <w:start w:val="1"/>
+      <w:numFmt w:val="bullet"/>
+      <w:lvlText w:val=""/>
+      <w:lvlJc w:val="left"/>
+      <w:pPr>
+        <w:ind w:left="4320" w:hanging="360"/>
+      </w:pPr>
+      <w:rPr>
+        <w:rFonts w:ascii="Wingdings" w:hAnsi="Wingdings" w:hint="default"/>
+      </w:rPr>
+    </w:lvl>
+    <w:lvl w:ilvl="6" w:tplc="04090001" w:tentative="1">
+      <w:start w:val="1"/>
+      <w:numFmt w:val="bullet"/>
+      <w:lvlText w:val=""/>
+      <w:lvlJc w:val="left"/>
+      <w:pPr>
+        <w:ind w:left="5040" w:hanging="360"/>
+      </w:pPr>
+      <w:rPr>
+        <w:rFonts w:ascii="Symbol" w:hAnsi="Symbol" w:hint="default"/>
+      </w:rPr>
+    </w:lvl>
+    <w:lvl w:ilvl="7" w:tplc="04090003" w:tentative="1">
+      <w:start w:val="1"/>
+      <w:numFmt w:val="bullet"/>
+      <w:lvlText w:val="o"/>
+      <w:lvlJc w:val="left"/>
+      <w:pPr>
+        <w:ind w:left="5760" w:hanging="360"/>
+      </w:pPr>
+      <w:rPr>
+        <w:rFonts w:ascii="Courier New" w:hAnsi="Courier New" w:cs="Courier New" w:hint="default"/>
+      </w:rPr>
+    </w:lvl>
+    <w:lvl w:ilvl="8" w:tplc="04090005" w:tentative="1">
+      <w:start w:val="1"/>
+      <w:numFmt w:val="bullet"/>
+      <w:lvlText w:val=""/>
+      <w:lvlJc w:val="left"/>
+      <w:pPr>
+        <w:ind w:left="6480" w:hanging="360"/>
+      </w:pPr>
+      <w:rPr>
+        <w:rFonts w:ascii="Wingdings" w:hAnsi="Wingdings" w:hint="default"/>
+      </w:rPr>
+    </w:lvl>
+  </w:abstractNum>
+  <w:abstractNum w:abstractNumId="1" w15:restartNumberingAfterBreak="0">
     <w:nsid w:val="11F524CD"/>
     <w:multiLevelType w:val="hybridMultilevel"/>
     <w:tmpl w:val="2E62CF84"/>
@@ -7253,7 +11007,7 @@
       </w:rPr>
     </w:lvl>
   </w:abstractNum>
-  <w:abstractNum w:abstractNumId="1" w15:restartNumberingAfterBreak="0">
+  <w:abstractNum w:abstractNumId="2" w15:restartNumberingAfterBreak="0">
     <w:nsid w:val="14F07280"/>
     <w:multiLevelType w:val="hybridMultilevel"/>
     <w:tmpl w:val="D2CA44DC"/>
@@ -7366,7 +11120,7 @@
       </w:rPr>
     </w:lvl>
   </w:abstractNum>
-  <w:abstractNum w:abstractNumId="2" w15:restartNumberingAfterBreak="0">
+  <w:abstractNum w:abstractNumId="3" w15:restartNumberingAfterBreak="0">
     <w:nsid w:val="17E60D3B"/>
     <w:multiLevelType w:val="hybridMultilevel"/>
     <w:tmpl w:val="61E2879C"/>
@@ -7479,7 +11233,7 @@
       </w:rPr>
     </w:lvl>
   </w:abstractNum>
-  <w:abstractNum w:abstractNumId="3" w15:restartNumberingAfterBreak="0">
+  <w:abstractNum w:abstractNumId="4" w15:restartNumberingAfterBreak="0">
     <w:nsid w:val="195930CC"/>
     <w:multiLevelType w:val="hybridMultilevel"/>
     <w:tmpl w:val="6C9ACE20"/>
@@ -7592,7 +11346,7 @@
       </w:rPr>
     </w:lvl>
   </w:abstractNum>
-  <w:abstractNum w:abstractNumId="4" w15:restartNumberingAfterBreak="0">
+  <w:abstractNum w:abstractNumId="5" w15:restartNumberingAfterBreak="0">
     <w:nsid w:val="198D7719"/>
     <w:multiLevelType w:val="hybridMultilevel"/>
     <w:tmpl w:val="B6323DDA"/>
@@ -7705,7 +11459,7 @@
       </w:rPr>
     </w:lvl>
   </w:abstractNum>
-  <w:abstractNum w:abstractNumId="5" w15:restartNumberingAfterBreak="0">
+  <w:abstractNum w:abstractNumId="6" w15:restartNumberingAfterBreak="0">
     <w:nsid w:val="19C24B32"/>
     <w:multiLevelType w:val="hybridMultilevel"/>
     <w:tmpl w:val="E6FAB460"/>
@@ -7818,7 +11572,7 @@
       </w:rPr>
     </w:lvl>
   </w:abstractNum>
-  <w:abstractNum w:abstractNumId="6" w15:restartNumberingAfterBreak="0">
+  <w:abstractNum w:abstractNumId="7" w15:restartNumberingAfterBreak="0">
     <w:nsid w:val="1AB83C4D"/>
     <w:multiLevelType w:val="hybridMultilevel"/>
     <w:tmpl w:val="4CAA9104"/>
@@ -7904,7 +11658,7 @@
       </w:pPr>
     </w:lvl>
   </w:abstractNum>
-  <w:abstractNum w:abstractNumId="7" w15:restartNumberingAfterBreak="0">
+  <w:abstractNum w:abstractNumId="8" w15:restartNumberingAfterBreak="0">
     <w:nsid w:val="2D7B007F"/>
     <w:multiLevelType w:val="hybridMultilevel"/>
     <w:tmpl w:val="8E04C004"/>
@@ -8017,7 +11771,7 @@
       </w:rPr>
     </w:lvl>
   </w:abstractNum>
-  <w:abstractNum w:abstractNumId="8" w15:restartNumberingAfterBreak="0">
+  <w:abstractNum w:abstractNumId="9" w15:restartNumberingAfterBreak="0">
     <w:nsid w:val="2D972F5B"/>
     <w:multiLevelType w:val="hybridMultilevel"/>
     <w:tmpl w:val="96A24D6A"/>
@@ -8130,7 +11884,120 @@
       </w:rPr>
     </w:lvl>
   </w:abstractNum>
-  <w:abstractNum w:abstractNumId="9" w15:restartNumberingAfterBreak="0">
+  <w:abstractNum w:abstractNumId="10" w15:restartNumberingAfterBreak="0">
+    <w:nsid w:val="2F1C10FF"/>
+    <w:multiLevelType w:val="hybridMultilevel"/>
+    <w:tmpl w:val="973A1186"/>
+    <w:lvl w:ilvl="0" w:tplc="04090001">
+      <w:start w:val="1"/>
+      <w:numFmt w:val="bullet"/>
+      <w:lvlText w:val=""/>
+      <w:lvlJc w:val="left"/>
+      <w:pPr>
+        <w:ind w:left="720" w:hanging="360"/>
+      </w:pPr>
+      <w:rPr>
+        <w:rFonts w:ascii="Symbol" w:hAnsi="Symbol" w:hint="default"/>
+      </w:rPr>
+    </w:lvl>
+    <w:lvl w:ilvl="1" w:tplc="04090003">
+      <w:start w:val="1"/>
+      <w:numFmt w:val="bullet"/>
+      <w:lvlText w:val="o"/>
+      <w:lvlJc w:val="left"/>
+      <w:pPr>
+        <w:ind w:left="1440" w:hanging="360"/>
+      </w:pPr>
+      <w:rPr>
+        <w:rFonts w:ascii="Courier New" w:hAnsi="Courier New" w:cs="Courier New" w:hint="default"/>
+      </w:rPr>
+    </w:lvl>
+    <w:lvl w:ilvl="2" w:tplc="04090005">
+      <w:start w:val="1"/>
+      <w:numFmt w:val="bullet"/>
+      <w:lvlText w:val=""/>
+      <w:lvlJc w:val="left"/>
+      <w:pPr>
+        <w:ind w:left="2160" w:hanging="360"/>
+      </w:pPr>
+      <w:rPr>
+        <w:rFonts w:ascii="Wingdings" w:hAnsi="Wingdings" w:hint="default"/>
+      </w:rPr>
+    </w:lvl>
+    <w:lvl w:ilvl="3" w:tplc="04090001">
+      <w:start w:val="1"/>
+      <w:numFmt w:val="bullet"/>
+      <w:lvlText w:val=""/>
+      <w:lvlJc w:val="left"/>
+      <w:pPr>
+        <w:ind w:left="2880" w:hanging="360"/>
+      </w:pPr>
+      <w:rPr>
+        <w:rFonts w:ascii="Symbol" w:hAnsi="Symbol" w:hint="default"/>
+      </w:rPr>
+    </w:lvl>
+    <w:lvl w:ilvl="4" w:tplc="04090003" w:tentative="1">
+      <w:start w:val="1"/>
+      <w:numFmt w:val="bullet"/>
+      <w:lvlText w:val="o"/>
+      <w:lvlJc w:val="left"/>
+      <w:pPr>
+        <w:ind w:left="3600" w:hanging="360"/>
+      </w:pPr>
+      <w:rPr>
+        <w:rFonts w:ascii="Courier New" w:hAnsi="Courier New" w:cs="Courier New" w:hint="default"/>
+      </w:rPr>
+    </w:lvl>
+    <w:lvl w:ilvl="5" w:tplc="04090005" w:tentative="1">
+      <w:start w:val="1"/>
+      <w:numFmt w:val="bullet"/>
+      <w:lvlText w:val=""/>
+      <w:lvlJc w:val="left"/>
+      <w:pPr>
+        <w:ind w:left="4320" w:hanging="360"/>
+      </w:pPr>
+      <w:rPr>
+        <w:rFonts w:ascii="Wingdings" w:hAnsi="Wingdings" w:hint="default"/>
+      </w:rPr>
+    </w:lvl>
+    <w:lvl w:ilvl="6" w:tplc="04090001" w:tentative="1">
+      <w:start w:val="1"/>
+      <w:numFmt w:val="bullet"/>
+      <w:lvlText w:val=""/>
+      <w:lvlJc w:val="left"/>
+      <w:pPr>
+        <w:ind w:left="5040" w:hanging="360"/>
+      </w:pPr>
+      <w:rPr>
+        <w:rFonts w:ascii="Symbol" w:hAnsi="Symbol" w:hint="default"/>
+      </w:rPr>
+    </w:lvl>
+    <w:lvl w:ilvl="7" w:tplc="04090003" w:tentative="1">
+      <w:start w:val="1"/>
+      <w:numFmt w:val="bullet"/>
+      <w:lvlText w:val="o"/>
+      <w:lvlJc w:val="left"/>
+      <w:pPr>
+        <w:ind w:left="5760" w:hanging="360"/>
+      </w:pPr>
+      <w:rPr>
+        <w:rFonts w:ascii="Courier New" w:hAnsi="Courier New" w:cs="Courier New" w:hint="default"/>
+      </w:rPr>
+    </w:lvl>
+    <w:lvl w:ilvl="8" w:tplc="04090005" w:tentative="1">
+      <w:start w:val="1"/>
+      <w:numFmt w:val="bullet"/>
+      <w:lvlText w:val=""/>
+      <w:lvlJc w:val="left"/>
+      <w:pPr>
+        <w:ind w:left="6480" w:hanging="360"/>
+      </w:pPr>
+      <w:rPr>
+        <w:rFonts w:ascii="Wingdings" w:hAnsi="Wingdings" w:hint="default"/>
+      </w:rPr>
+    </w:lvl>
+  </w:abstractNum>
+  <w:abstractNum w:abstractNumId="11" w15:restartNumberingAfterBreak="0">
     <w:nsid w:val="33365C09"/>
     <w:multiLevelType w:val="hybridMultilevel"/>
     <w:tmpl w:val="45D45812"/>
@@ -8243,7 +12110,7 @@
       </w:rPr>
     </w:lvl>
   </w:abstractNum>
-  <w:abstractNum w:abstractNumId="10" w15:restartNumberingAfterBreak="0">
+  <w:abstractNum w:abstractNumId="12" w15:restartNumberingAfterBreak="0">
     <w:nsid w:val="33F5794D"/>
     <w:multiLevelType w:val="hybridMultilevel"/>
     <w:tmpl w:val="597A0980"/>
@@ -8356,7 +12223,7 @@
       </w:rPr>
     </w:lvl>
   </w:abstractNum>
-  <w:abstractNum w:abstractNumId="11" w15:restartNumberingAfterBreak="0">
+  <w:abstractNum w:abstractNumId="13" w15:restartNumberingAfterBreak="0">
     <w:nsid w:val="35D746EF"/>
     <w:multiLevelType w:val="hybridMultilevel"/>
     <w:tmpl w:val="FD2AFA0E"/>
@@ -8469,7 +12336,7 @@
       </w:rPr>
     </w:lvl>
   </w:abstractNum>
-  <w:abstractNum w:abstractNumId="12" w15:restartNumberingAfterBreak="0">
+  <w:abstractNum w:abstractNumId="14" w15:restartNumberingAfterBreak="0">
     <w:nsid w:val="45AC08FF"/>
     <w:multiLevelType w:val="hybridMultilevel"/>
     <w:tmpl w:val="BE88EEFC"/>
@@ -8582,7 +12449,7 @@
       </w:rPr>
     </w:lvl>
   </w:abstractNum>
-  <w:abstractNum w:abstractNumId="13" w15:restartNumberingAfterBreak="0">
+  <w:abstractNum w:abstractNumId="15" w15:restartNumberingAfterBreak="0">
     <w:nsid w:val="45D52F45"/>
     <w:multiLevelType w:val="hybridMultilevel"/>
     <w:tmpl w:val="4A564208"/>
@@ -8695,7 +12562,120 @@
       </w:rPr>
     </w:lvl>
   </w:abstractNum>
-  <w:abstractNum w:abstractNumId="14" w15:restartNumberingAfterBreak="0">
+  <w:abstractNum w:abstractNumId="16" w15:restartNumberingAfterBreak="0">
+    <w:nsid w:val="4B2A475A"/>
+    <w:multiLevelType w:val="hybridMultilevel"/>
+    <w:tmpl w:val="08D40D3A"/>
+    <w:lvl w:ilvl="0" w:tplc="04090001">
+      <w:start w:val="1"/>
+      <w:numFmt w:val="bullet"/>
+      <w:lvlText w:val=""/>
+      <w:lvlJc w:val="left"/>
+      <w:pPr>
+        <w:ind w:left="720" w:hanging="360"/>
+      </w:pPr>
+      <w:rPr>
+        <w:rFonts w:ascii="Symbol" w:hAnsi="Symbol" w:hint="default"/>
+      </w:rPr>
+    </w:lvl>
+    <w:lvl w:ilvl="1" w:tplc="04090003" w:tentative="1">
+      <w:start w:val="1"/>
+      <w:numFmt w:val="bullet"/>
+      <w:lvlText w:val="o"/>
+      <w:lvlJc w:val="left"/>
+      <w:pPr>
+        <w:ind w:left="1440" w:hanging="360"/>
+      </w:pPr>
+      <w:rPr>
+        <w:rFonts w:ascii="Courier New" w:hAnsi="Courier New" w:cs="Courier New" w:hint="default"/>
+      </w:rPr>
+    </w:lvl>
+    <w:lvl w:ilvl="2" w:tplc="04090005" w:tentative="1">
+      <w:start w:val="1"/>
+      <w:numFmt w:val="bullet"/>
+      <w:lvlText w:val=""/>
+      <w:lvlJc w:val="left"/>
+      <w:pPr>
+        <w:ind w:left="2160" w:hanging="360"/>
+      </w:pPr>
+      <w:rPr>
+        <w:rFonts w:ascii="Wingdings" w:hAnsi="Wingdings" w:hint="default"/>
+      </w:rPr>
+    </w:lvl>
+    <w:lvl w:ilvl="3" w:tplc="04090001" w:tentative="1">
+      <w:start w:val="1"/>
+      <w:numFmt w:val="bullet"/>
+      <w:lvlText w:val=""/>
+      <w:lvlJc w:val="left"/>
+      <w:pPr>
+        <w:ind w:left="2880" w:hanging="360"/>
+      </w:pPr>
+      <w:rPr>
+        <w:rFonts w:ascii="Symbol" w:hAnsi="Symbol" w:hint="default"/>
+      </w:rPr>
+    </w:lvl>
+    <w:lvl w:ilvl="4" w:tplc="04090003" w:tentative="1">
+      <w:start w:val="1"/>
+      <w:numFmt w:val="bullet"/>
+      <w:lvlText w:val="o"/>
+      <w:lvlJc w:val="left"/>
+      <w:pPr>
+        <w:ind w:left="3600" w:hanging="360"/>
+      </w:pPr>
+      <w:rPr>
+        <w:rFonts w:ascii="Courier New" w:hAnsi="Courier New" w:cs="Courier New" w:hint="default"/>
+      </w:rPr>
+    </w:lvl>
+    <w:lvl w:ilvl="5" w:tplc="04090005" w:tentative="1">
+      <w:start w:val="1"/>
+      <w:numFmt w:val="bullet"/>
+      <w:lvlText w:val=""/>
+      <w:lvlJc w:val="left"/>
+      <w:pPr>
+        <w:ind w:left="4320" w:hanging="360"/>
+      </w:pPr>
+      <w:rPr>
+        <w:rFonts w:ascii="Wingdings" w:hAnsi="Wingdings" w:hint="default"/>
+      </w:rPr>
+    </w:lvl>
+    <w:lvl w:ilvl="6" w:tplc="04090001" w:tentative="1">
+      <w:start w:val="1"/>
+      <w:numFmt w:val="bullet"/>
+      <w:lvlText w:val=""/>
+      <w:lvlJc w:val="left"/>
+      <w:pPr>
+        <w:ind w:left="5040" w:hanging="360"/>
+      </w:pPr>
+      <w:rPr>
+        <w:rFonts w:ascii="Symbol" w:hAnsi="Symbol" w:hint="default"/>
+      </w:rPr>
+    </w:lvl>
+    <w:lvl w:ilvl="7" w:tplc="04090003" w:tentative="1">
+      <w:start w:val="1"/>
+      <w:numFmt w:val="bullet"/>
+      <w:lvlText w:val="o"/>
+      <w:lvlJc w:val="left"/>
+      <w:pPr>
+        <w:ind w:left="5760" w:hanging="360"/>
+      </w:pPr>
+      <w:rPr>
+        <w:rFonts w:ascii="Courier New" w:hAnsi="Courier New" w:cs="Courier New" w:hint="default"/>
+      </w:rPr>
+    </w:lvl>
+    <w:lvl w:ilvl="8" w:tplc="04090005" w:tentative="1">
+      <w:start w:val="1"/>
+      <w:numFmt w:val="bullet"/>
+      <w:lvlText w:val=""/>
+      <w:lvlJc w:val="left"/>
+      <w:pPr>
+        <w:ind w:left="6480" w:hanging="360"/>
+      </w:pPr>
+      <w:rPr>
+        <w:rFonts w:ascii="Wingdings" w:hAnsi="Wingdings" w:hint="default"/>
+      </w:rPr>
+    </w:lvl>
+  </w:abstractNum>
+  <w:abstractNum w:abstractNumId="17" w15:restartNumberingAfterBreak="0">
     <w:nsid w:val="5111387D"/>
     <w:multiLevelType w:val="hybridMultilevel"/>
     <w:tmpl w:val="3A786B7C"/>
@@ -8808,7 +12788,7 @@
       </w:rPr>
     </w:lvl>
   </w:abstractNum>
-  <w:abstractNum w:abstractNumId="15" w15:restartNumberingAfterBreak="0">
+  <w:abstractNum w:abstractNumId="18" w15:restartNumberingAfterBreak="0">
     <w:nsid w:val="52A379B7"/>
     <w:multiLevelType w:val="hybridMultilevel"/>
     <w:tmpl w:val="86421D38"/>
@@ -8921,7 +12901,7 @@
       </w:rPr>
     </w:lvl>
   </w:abstractNum>
-  <w:abstractNum w:abstractNumId="16" w15:restartNumberingAfterBreak="0">
+  <w:abstractNum w:abstractNumId="19" w15:restartNumberingAfterBreak="0">
     <w:nsid w:val="5A32722D"/>
     <w:multiLevelType w:val="hybridMultilevel"/>
     <w:tmpl w:val="EC3EA65E"/>
@@ -9034,7 +13014,93 @@
       </w:rPr>
     </w:lvl>
   </w:abstractNum>
-  <w:abstractNum w:abstractNumId="17" w15:restartNumberingAfterBreak="0">
+  <w:abstractNum w:abstractNumId="20" w15:restartNumberingAfterBreak="0">
+    <w:nsid w:val="5AEC6294"/>
+    <w:multiLevelType w:val="hybridMultilevel"/>
+    <w:tmpl w:val="110AF7DC"/>
+    <w:lvl w:ilvl="0" w:tplc="0409000F">
+      <w:start w:val="1"/>
+      <w:numFmt w:val="decimal"/>
+      <w:lvlText w:val="%1."/>
+      <w:lvlJc w:val="left"/>
+      <w:pPr>
+        <w:ind w:left="720" w:hanging="360"/>
+      </w:pPr>
+    </w:lvl>
+    <w:lvl w:ilvl="1" w:tplc="04090019">
+      <w:start w:val="1"/>
+      <w:numFmt w:val="lowerLetter"/>
+      <w:lvlText w:val="%2."/>
+      <w:lvlJc w:val="left"/>
+      <w:pPr>
+        <w:ind w:left="1440" w:hanging="360"/>
+      </w:pPr>
+    </w:lvl>
+    <w:lvl w:ilvl="2" w:tplc="0409001B">
+      <w:start w:val="1"/>
+      <w:numFmt w:val="lowerRoman"/>
+      <w:lvlText w:val="%3."/>
+      <w:lvlJc w:val="right"/>
+      <w:pPr>
+        <w:ind w:left="2160" w:hanging="180"/>
+      </w:pPr>
+    </w:lvl>
+    <w:lvl w:ilvl="3" w:tplc="0409000F" w:tentative="1">
+      <w:start w:val="1"/>
+      <w:numFmt w:val="decimal"/>
+      <w:lvlText w:val="%4."/>
+      <w:lvlJc w:val="left"/>
+      <w:pPr>
+        <w:ind w:left="2880" w:hanging="360"/>
+      </w:pPr>
+    </w:lvl>
+    <w:lvl w:ilvl="4" w:tplc="04090019" w:tentative="1">
+      <w:start w:val="1"/>
+      <w:numFmt w:val="lowerLetter"/>
+      <w:lvlText w:val="%5."/>
+      <w:lvlJc w:val="left"/>
+      <w:pPr>
+        <w:ind w:left="3600" w:hanging="360"/>
+      </w:pPr>
+    </w:lvl>
+    <w:lvl w:ilvl="5" w:tplc="0409001B" w:tentative="1">
+      <w:start w:val="1"/>
+      <w:numFmt w:val="lowerRoman"/>
+      <w:lvlText w:val="%6."/>
+      <w:lvlJc w:val="right"/>
+      <w:pPr>
+        <w:ind w:left="4320" w:hanging="180"/>
+      </w:pPr>
+    </w:lvl>
+    <w:lvl w:ilvl="6" w:tplc="0409000F" w:tentative="1">
+      <w:start w:val="1"/>
+      <w:numFmt w:val="decimal"/>
+      <w:lvlText w:val="%7."/>
+      <w:lvlJc w:val="left"/>
+      <w:pPr>
+        <w:ind w:left="5040" w:hanging="360"/>
+      </w:pPr>
+    </w:lvl>
+    <w:lvl w:ilvl="7" w:tplc="04090019" w:tentative="1">
+      <w:start w:val="1"/>
+      <w:numFmt w:val="lowerLetter"/>
+      <w:lvlText w:val="%8."/>
+      <w:lvlJc w:val="left"/>
+      <w:pPr>
+        <w:ind w:left="5760" w:hanging="360"/>
+      </w:pPr>
+    </w:lvl>
+    <w:lvl w:ilvl="8" w:tplc="0409001B" w:tentative="1">
+      <w:start w:val="1"/>
+      <w:numFmt w:val="lowerRoman"/>
+      <w:lvlText w:val="%9."/>
+      <w:lvlJc w:val="right"/>
+      <w:pPr>
+        <w:ind w:left="6480" w:hanging="180"/>
+      </w:pPr>
+    </w:lvl>
+  </w:abstractNum>
+  <w:abstractNum w:abstractNumId="21" w15:restartNumberingAfterBreak="0">
     <w:nsid w:val="62A4779C"/>
     <w:multiLevelType w:val="hybridMultilevel"/>
     <w:tmpl w:val="42260B1C"/>
@@ -9147,7 +13213,7 @@
       </w:rPr>
     </w:lvl>
   </w:abstractNum>
-  <w:abstractNum w:abstractNumId="18" w15:restartNumberingAfterBreak="0">
+  <w:abstractNum w:abstractNumId="22" w15:restartNumberingAfterBreak="0">
     <w:nsid w:val="65E71856"/>
     <w:multiLevelType w:val="hybridMultilevel"/>
     <w:tmpl w:val="8A3CB98E"/>
@@ -9260,7 +13326,7 @@
       </w:rPr>
     </w:lvl>
   </w:abstractNum>
-  <w:abstractNum w:abstractNumId="19" w15:restartNumberingAfterBreak="0">
+  <w:abstractNum w:abstractNumId="23" w15:restartNumberingAfterBreak="0">
     <w:nsid w:val="67451544"/>
     <w:multiLevelType w:val="hybridMultilevel"/>
     <w:tmpl w:val="DD6E8660"/>
@@ -9373,7 +13439,93 @@
       </w:rPr>
     </w:lvl>
   </w:abstractNum>
-  <w:abstractNum w:abstractNumId="20" w15:restartNumberingAfterBreak="0">
+  <w:abstractNum w:abstractNumId="24" w15:restartNumberingAfterBreak="0">
+    <w:nsid w:val="6AD37188"/>
+    <w:multiLevelType w:val="hybridMultilevel"/>
+    <w:tmpl w:val="753299EA"/>
+    <w:lvl w:ilvl="0" w:tplc="0409000F">
+      <w:start w:val="1"/>
+      <w:numFmt w:val="decimal"/>
+      <w:lvlText w:val="%1."/>
+      <w:lvlJc w:val="left"/>
+      <w:pPr>
+        <w:ind w:left="720" w:hanging="360"/>
+      </w:pPr>
+    </w:lvl>
+    <w:lvl w:ilvl="1" w:tplc="04090019">
+      <w:start w:val="1"/>
+      <w:numFmt w:val="lowerLetter"/>
+      <w:lvlText w:val="%2."/>
+      <w:lvlJc w:val="left"/>
+      <w:pPr>
+        <w:ind w:left="1440" w:hanging="360"/>
+      </w:pPr>
+    </w:lvl>
+    <w:lvl w:ilvl="2" w:tplc="0409001B" w:tentative="1">
+      <w:start w:val="1"/>
+      <w:numFmt w:val="lowerRoman"/>
+      <w:lvlText w:val="%3."/>
+      <w:lvlJc w:val="right"/>
+      <w:pPr>
+        <w:ind w:left="2160" w:hanging="180"/>
+      </w:pPr>
+    </w:lvl>
+    <w:lvl w:ilvl="3" w:tplc="0409000F" w:tentative="1">
+      <w:start w:val="1"/>
+      <w:numFmt w:val="decimal"/>
+      <w:lvlText w:val="%4."/>
+      <w:lvlJc w:val="left"/>
+      <w:pPr>
+        <w:ind w:left="2880" w:hanging="360"/>
+      </w:pPr>
+    </w:lvl>
+    <w:lvl w:ilvl="4" w:tplc="04090019" w:tentative="1">
+      <w:start w:val="1"/>
+      <w:numFmt w:val="lowerLetter"/>
+      <w:lvlText w:val="%5."/>
+      <w:lvlJc w:val="left"/>
+      <w:pPr>
+        <w:ind w:left="3600" w:hanging="360"/>
+      </w:pPr>
+    </w:lvl>
+    <w:lvl w:ilvl="5" w:tplc="0409001B" w:tentative="1">
+      <w:start w:val="1"/>
+      <w:numFmt w:val="lowerRoman"/>
+      <w:lvlText w:val="%6."/>
+      <w:lvlJc w:val="right"/>
+      <w:pPr>
+        <w:ind w:left="4320" w:hanging="180"/>
+      </w:pPr>
+    </w:lvl>
+    <w:lvl w:ilvl="6" w:tplc="0409000F" w:tentative="1">
+      <w:start w:val="1"/>
+      <w:numFmt w:val="decimal"/>
+      <w:lvlText w:val="%7."/>
+      <w:lvlJc w:val="left"/>
+      <w:pPr>
+        <w:ind w:left="5040" w:hanging="360"/>
+      </w:pPr>
+    </w:lvl>
+    <w:lvl w:ilvl="7" w:tplc="04090019" w:tentative="1">
+      <w:start w:val="1"/>
+      <w:numFmt w:val="lowerLetter"/>
+      <w:lvlText w:val="%8."/>
+      <w:lvlJc w:val="left"/>
+      <w:pPr>
+        <w:ind w:left="5760" w:hanging="360"/>
+      </w:pPr>
+    </w:lvl>
+    <w:lvl w:ilvl="8" w:tplc="0409001B" w:tentative="1">
+      <w:start w:val="1"/>
+      <w:numFmt w:val="lowerRoman"/>
+      <w:lvlText w:val="%9."/>
+      <w:lvlJc w:val="right"/>
+      <w:pPr>
+        <w:ind w:left="6480" w:hanging="180"/>
+      </w:pPr>
+    </w:lvl>
+  </w:abstractNum>
+  <w:abstractNum w:abstractNumId="25" w15:restartNumberingAfterBreak="0">
     <w:nsid w:val="6B806D1C"/>
     <w:multiLevelType w:val="hybridMultilevel"/>
     <w:tmpl w:val="2B4C74FA"/>
@@ -9486,7 +13638,120 @@
       </w:rPr>
     </w:lvl>
   </w:abstractNum>
-  <w:abstractNum w:abstractNumId="21" w15:restartNumberingAfterBreak="0">
+  <w:abstractNum w:abstractNumId="26" w15:restartNumberingAfterBreak="0">
+    <w:nsid w:val="6D800A4E"/>
+    <w:multiLevelType w:val="hybridMultilevel"/>
+    <w:tmpl w:val="FA380226"/>
+    <w:lvl w:ilvl="0" w:tplc="04090001">
+      <w:start w:val="1"/>
+      <w:numFmt w:val="bullet"/>
+      <w:lvlText w:val=""/>
+      <w:lvlJc w:val="left"/>
+      <w:pPr>
+        <w:ind w:left="770" w:hanging="360"/>
+      </w:pPr>
+      <w:rPr>
+        <w:rFonts w:ascii="Symbol" w:hAnsi="Symbol" w:hint="default"/>
+      </w:rPr>
+    </w:lvl>
+    <w:lvl w:ilvl="1" w:tplc="04090003" w:tentative="1">
+      <w:start w:val="1"/>
+      <w:numFmt w:val="bullet"/>
+      <w:lvlText w:val="o"/>
+      <w:lvlJc w:val="left"/>
+      <w:pPr>
+        <w:ind w:left="1490" w:hanging="360"/>
+      </w:pPr>
+      <w:rPr>
+        <w:rFonts w:ascii="Courier New" w:hAnsi="Courier New" w:cs="Courier New" w:hint="default"/>
+      </w:rPr>
+    </w:lvl>
+    <w:lvl w:ilvl="2" w:tplc="04090005" w:tentative="1">
+      <w:start w:val="1"/>
+      <w:numFmt w:val="bullet"/>
+      <w:lvlText w:val=""/>
+      <w:lvlJc w:val="left"/>
+      <w:pPr>
+        <w:ind w:left="2210" w:hanging="360"/>
+      </w:pPr>
+      <w:rPr>
+        <w:rFonts w:ascii="Wingdings" w:hAnsi="Wingdings" w:hint="default"/>
+      </w:rPr>
+    </w:lvl>
+    <w:lvl w:ilvl="3" w:tplc="04090001" w:tentative="1">
+      <w:start w:val="1"/>
+      <w:numFmt w:val="bullet"/>
+      <w:lvlText w:val=""/>
+      <w:lvlJc w:val="left"/>
+      <w:pPr>
+        <w:ind w:left="2930" w:hanging="360"/>
+      </w:pPr>
+      <w:rPr>
+        <w:rFonts w:ascii="Symbol" w:hAnsi="Symbol" w:hint="default"/>
+      </w:rPr>
+    </w:lvl>
+    <w:lvl w:ilvl="4" w:tplc="04090003" w:tentative="1">
+      <w:start w:val="1"/>
+      <w:numFmt w:val="bullet"/>
+      <w:lvlText w:val="o"/>
+      <w:lvlJc w:val="left"/>
+      <w:pPr>
+        <w:ind w:left="3650" w:hanging="360"/>
+      </w:pPr>
+      <w:rPr>
+        <w:rFonts w:ascii="Courier New" w:hAnsi="Courier New" w:cs="Courier New" w:hint="default"/>
+      </w:rPr>
+    </w:lvl>
+    <w:lvl w:ilvl="5" w:tplc="04090005" w:tentative="1">
+      <w:start w:val="1"/>
+      <w:numFmt w:val="bullet"/>
+      <w:lvlText w:val=""/>
+      <w:lvlJc w:val="left"/>
+      <w:pPr>
+        <w:ind w:left="4370" w:hanging="360"/>
+      </w:pPr>
+      <w:rPr>
+        <w:rFonts w:ascii="Wingdings" w:hAnsi="Wingdings" w:hint="default"/>
+      </w:rPr>
+    </w:lvl>
+    <w:lvl w:ilvl="6" w:tplc="04090001" w:tentative="1">
+      <w:start w:val="1"/>
+      <w:numFmt w:val="bullet"/>
+      <w:lvlText w:val=""/>
+      <w:lvlJc w:val="left"/>
+      <w:pPr>
+        <w:ind w:left="5090" w:hanging="360"/>
+      </w:pPr>
+      <w:rPr>
+        <w:rFonts w:ascii="Symbol" w:hAnsi="Symbol" w:hint="default"/>
+      </w:rPr>
+    </w:lvl>
+    <w:lvl w:ilvl="7" w:tplc="04090003" w:tentative="1">
+      <w:start w:val="1"/>
+      <w:numFmt w:val="bullet"/>
+      <w:lvlText w:val="o"/>
+      <w:lvlJc w:val="left"/>
+      <w:pPr>
+        <w:ind w:left="5810" w:hanging="360"/>
+      </w:pPr>
+      <w:rPr>
+        <w:rFonts w:ascii="Courier New" w:hAnsi="Courier New" w:cs="Courier New" w:hint="default"/>
+      </w:rPr>
+    </w:lvl>
+    <w:lvl w:ilvl="8" w:tplc="04090005" w:tentative="1">
+      <w:start w:val="1"/>
+      <w:numFmt w:val="bullet"/>
+      <w:lvlText w:val=""/>
+      <w:lvlJc w:val="left"/>
+      <w:pPr>
+        <w:ind w:left="6530" w:hanging="360"/>
+      </w:pPr>
+      <w:rPr>
+        <w:rFonts w:ascii="Wingdings" w:hAnsi="Wingdings" w:hint="default"/>
+      </w:rPr>
+    </w:lvl>
+  </w:abstractNum>
+  <w:abstractNum w:abstractNumId="27" w15:restartNumberingAfterBreak="0">
     <w:nsid w:val="6FE02EB1"/>
     <w:multiLevelType w:val="hybridMultilevel"/>
     <w:tmpl w:val="D742B43A"/>
@@ -9600,70 +13865,88 @@
     </w:lvl>
   </w:abstractNum>
   <w:num w:numId="1" w16cid:durableId="688483258">
+    <w:abstractNumId w:val="4"/>
+  </w:num>
+  <w:num w:numId="2" w16cid:durableId="314990022">
+    <w:abstractNumId w:val="8"/>
+  </w:num>
+  <w:num w:numId="3" w16cid:durableId="521240542">
+    <w:abstractNumId w:val="14"/>
+  </w:num>
+  <w:num w:numId="4" w16cid:durableId="592932221">
+    <w:abstractNumId w:val="11"/>
+  </w:num>
+  <w:num w:numId="5" w16cid:durableId="73479126">
+    <w:abstractNumId w:val="23"/>
+  </w:num>
+  <w:num w:numId="6" w16cid:durableId="2090074770">
+    <w:abstractNumId w:val="9"/>
+  </w:num>
+  <w:num w:numId="7" w16cid:durableId="2046641010">
+    <w:abstractNumId w:val="21"/>
+  </w:num>
+  <w:num w:numId="8" w16cid:durableId="1768964945">
+    <w:abstractNumId w:val="12"/>
+  </w:num>
+  <w:num w:numId="9" w16cid:durableId="2120248886">
+    <w:abstractNumId w:val="22"/>
+  </w:num>
+  <w:num w:numId="10" w16cid:durableId="1424298697">
+    <w:abstractNumId w:val="19"/>
+  </w:num>
+  <w:num w:numId="11" w16cid:durableId="1495099596">
+    <w:abstractNumId w:val="7"/>
+  </w:num>
+  <w:num w:numId="12" w16cid:durableId="391272851">
+    <w:abstractNumId w:val="13"/>
+  </w:num>
+  <w:num w:numId="13" w16cid:durableId="1793327130">
+    <w:abstractNumId w:val="6"/>
+  </w:num>
+  <w:num w:numId="14" w16cid:durableId="2032367589">
+    <w:abstractNumId w:val="25"/>
+  </w:num>
+  <w:num w:numId="15" w16cid:durableId="2043509731">
     <w:abstractNumId w:val="3"/>
   </w:num>
-  <w:num w:numId="2" w16cid:durableId="314990022">
-    <w:abstractNumId w:val="7"/>
-  </w:num>
-  <w:num w:numId="3" w16cid:durableId="521240542">
-    <w:abstractNumId w:val="12"/>
-  </w:num>
-  <w:num w:numId="4" w16cid:durableId="592932221">
-    <w:abstractNumId w:val="9"/>
-  </w:num>
-  <w:num w:numId="5" w16cid:durableId="73479126">
-    <w:abstractNumId w:val="19"/>
-  </w:num>
-  <w:num w:numId="6" w16cid:durableId="2090074770">
-    <w:abstractNumId w:val="8"/>
-  </w:num>
-  <w:num w:numId="7" w16cid:durableId="2046641010">
+  <w:num w:numId="16" w16cid:durableId="721489532">
     <w:abstractNumId w:val="17"/>
   </w:num>
-  <w:num w:numId="8" w16cid:durableId="1768964945">
+  <w:num w:numId="17" w16cid:durableId="323583031">
+    <w:abstractNumId w:val="1"/>
+  </w:num>
+  <w:num w:numId="18" w16cid:durableId="1041125601">
+    <w:abstractNumId w:val="2"/>
+  </w:num>
+  <w:num w:numId="19" w16cid:durableId="375619000">
+    <w:abstractNumId w:val="18"/>
+  </w:num>
+  <w:num w:numId="20" w16cid:durableId="60253754">
+    <w:abstractNumId w:val="5"/>
+  </w:num>
+  <w:num w:numId="21" w16cid:durableId="1119492283">
+    <w:abstractNumId w:val="27"/>
+  </w:num>
+  <w:num w:numId="22" w16cid:durableId="1527938521">
+    <w:abstractNumId w:val="15"/>
+  </w:num>
+  <w:num w:numId="23" w16cid:durableId="929002792">
+    <w:abstractNumId w:val="16"/>
+  </w:num>
+  <w:num w:numId="24" w16cid:durableId="708845605">
+    <w:abstractNumId w:val="26"/>
+  </w:num>
+  <w:num w:numId="25" w16cid:durableId="1045714812">
+    <w:abstractNumId w:val="0"/>
+  </w:num>
+  <w:num w:numId="26" w16cid:durableId="403838669">
+    <w:abstractNumId w:val="20"/>
+  </w:num>
+  <w:num w:numId="27" w16cid:durableId="2112701798">
     <w:abstractNumId w:val="10"/>
   </w:num>
-  <w:num w:numId="9" w16cid:durableId="2120248886">
-    <w:abstractNumId w:val="18"/>
-  </w:num>
-  <w:num w:numId="10" w16cid:durableId="1424298697">
-    <w:abstractNumId w:val="16"/>
-  </w:num>
-  <w:num w:numId="11" w16cid:durableId="1495099596">
-    <w:abstractNumId w:val="6"/>
-  </w:num>
-  <w:num w:numId="12" w16cid:durableId="391272851">
-    <w:abstractNumId w:val="11"/>
-  </w:num>
-  <w:num w:numId="13" w16cid:durableId="1793327130">
-    <w:abstractNumId w:val="5"/>
-  </w:num>
-  <w:num w:numId="14" w16cid:durableId="2032367589">
-    <w:abstractNumId w:val="20"/>
-  </w:num>
-  <w:num w:numId="15" w16cid:durableId="2043509731">
-    <w:abstractNumId w:val="2"/>
-  </w:num>
-  <w:num w:numId="16" w16cid:durableId="721489532">
-    <w:abstractNumId w:val="14"/>
-  </w:num>
-  <w:num w:numId="17" w16cid:durableId="323583031">
-    <w:abstractNumId w:val="0"/>
-  </w:num>
-  <w:num w:numId="18" w16cid:durableId="1041125601">
-    <w:abstractNumId w:val="1"/>
-  </w:num>
-  <w:num w:numId="19" w16cid:durableId="375619000">
-    <w:abstractNumId w:val="15"/>
-  </w:num>
-  <w:num w:numId="20" w16cid:durableId="60253754">
-    <w:abstractNumId w:val="4"/>
-  </w:num>
-  <w:num w:numId="21" w16cid:durableId="1119492283">
-    <w:abstractNumId w:val="21"/>
-  </w:num>
-  <w:num w:numId="22" w16cid:durableId="1527938521">
-    <w:abstractNumId w:val="13"/>
+  <w:num w:numId="28" w16cid:durableId="58023244">
+    <w:abstractNumId w:val="24"/>
   </w:num>
 </w:numbering>
 </file>
@@ -10117,10 +14400,11 @@
     <w:basedOn w:val="Normal"/>
     <w:next w:val="Normal"/>
     <w:link w:val="Heading3Char"/>
+    <w:autoRedefine/>
     <w:uiPriority w:val="9"/>
     <w:unhideWhenUsed/>
     <w:qFormat/>
-    <w:rsid w:val="003943DF"/>
+    <w:rsid w:val="00CC0705"/>
     <w:pPr>
       <w:keepNext/>
       <w:keepLines/>
@@ -10129,7 +14413,8 @@
     </w:pPr>
     <w:rPr>
       <w:rFonts w:eastAsiaTheme="majorEastAsia" w:cstheme="majorBidi"/>
-      <w:color w:val="0F4761" w:themeColor="accent1" w:themeShade="BF"/>
+      <w:b/>
+      <w:color w:val="215E99" w:themeColor="text2" w:themeTint="BF"/>
       <w:sz w:val="28"/>
       <w:szCs w:val="28"/>
     </w:rPr>
@@ -10162,7 +14447,6 @@
     <w:next w:val="Normal"/>
     <w:link w:val="Heading5Char"/>
     <w:uiPriority w:val="9"/>
-    <w:semiHidden/>
     <w:unhideWhenUsed/>
     <w:qFormat/>
     <w:rsid w:val="003943DF"/>
@@ -10268,7 +14552,6 @@
   <w:style w:type="character" w:default="1" w:styleId="DefaultParagraphFont">
     <w:name w:val="Default Paragraph Font"/>
     <w:uiPriority w:val="1"/>
-    <w:semiHidden/>
     <w:unhideWhenUsed/>
   </w:style>
   <w:style w:type="table" w:default="1" w:styleId="TableNormal">
@@ -10323,10 +14606,11 @@
     <w:basedOn w:val="DefaultParagraphFont"/>
     <w:link w:val="Heading3"/>
     <w:uiPriority w:val="9"/>
-    <w:rsid w:val="003943DF"/>
+    <w:rsid w:val="00CC0705"/>
     <w:rPr>
       <w:rFonts w:eastAsiaTheme="majorEastAsia" w:cstheme="majorBidi"/>
-      <w:color w:val="0F4761" w:themeColor="accent1" w:themeShade="BF"/>
+      <w:b/>
+      <w:color w:val="215E99" w:themeColor="text2" w:themeTint="BF"/>
       <w:sz w:val="28"/>
       <w:szCs w:val="28"/>
     </w:rPr>
@@ -10349,7 +14633,6 @@
     <w:basedOn w:val="DefaultParagraphFont"/>
     <w:link w:val="Heading5"/>
     <w:uiPriority w:val="9"/>
-    <w:semiHidden/>
     <w:rsid w:val="003943DF"/>
     <w:rPr>
       <w:rFonts w:eastAsiaTheme="majorEastAsia" w:cstheme="majorBidi"/>

</xml_diff>